<commit_message>
KP :  Python App API Calls	Run : python -m uvicorn mssqlconn:app --reload
</commit_message>
<xml_diff>
--- a/Literature/KPPythonApp.docx
+++ b/Literature/KPPythonApp.docx
@@ -1,6 +1,6 @@
 
 <file path=word/document.xml><?xml version="1.0" encoding="utf-8"?>
-<w:document xmlns:wpc="http://schemas.microsoft.com/office/word/2010/wordprocessingCanvas" xmlns:cx="http://schemas.microsoft.com/office/drawing/2014/chartex" xmlns:cx1="http://schemas.microsoft.com/office/drawing/2015/9/8/chartex" xmlns:cx2="http://schemas.microsoft.com/office/drawing/2015/10/21/chartex" xmlns:cx3="http://schemas.microsoft.com/office/drawing/2016/5/9/chartex" xmlns:cx4="http://schemas.microsoft.com/office/drawing/2016/5/10/chartex" xmlns:cx5="http://schemas.microsoft.com/office/drawing/2016/5/11/chartex" xmlns:cx6="http://schemas.microsoft.com/office/drawing/2016/5/12/chartex" xmlns:cx7="http://schemas.microsoft.com/office/drawing/2016/5/13/chartex" xmlns:cx8="http://schemas.microsoft.com/office/drawing/2016/5/14/chartex" xmlns:mc="http://schemas.openxmlformats.org/markup-compatibility/2006" xmlns:aink="http://schemas.microsoft.com/office/drawing/2016/ink" xmlns:am3d="http://schemas.microsoft.com/office/drawing/2017/model3d" xmlns:o="urn:schemas-microsoft-com:office:office" xmlns:r="http://schemas.openxmlformats.org/officeDocument/2006/relationships" xmlns:m="http://schemas.openxmlformats.org/officeDocument/2006/math" xmlns:v="urn:schemas-microsoft-com:vml" xmlns:wp14="http://schemas.microsoft.com/office/word/2010/wordprocessingDrawing" xmlns:wp="http://schemas.openxmlformats.org/drawingml/2006/wordprocessingDrawing" xmlns:w10="urn:schemas-microsoft-com:office:word" xmlns:w="http://schemas.openxmlformats.org/wordprocessingml/2006/main" xmlns:w14="http://schemas.microsoft.com/office/word/2010/wordml" xmlns:w15="http://schemas.microsoft.com/office/word/2012/wordml" xmlns:w16cid="http://schemas.microsoft.com/office/word/2016/wordml/cid" xmlns:w16se="http://schemas.microsoft.com/office/word/2015/wordml/symex" xmlns:wpg="http://schemas.microsoft.com/office/word/2010/wordprocessingGroup" xmlns:wpi="http://schemas.microsoft.com/office/word/2010/wordprocessingInk" xmlns:wne="http://schemas.microsoft.com/office/word/2006/wordml" xmlns:wps="http://schemas.microsoft.com/office/word/2010/wordprocessingShape" mc:Ignorable="w14 w15 w16se w16cid wp14">
+<w:document xmlns:wpc="http://schemas.microsoft.com/office/word/2010/wordprocessingCanvas" xmlns:cx="http://schemas.microsoft.com/office/drawing/2014/chartex" xmlns:cx1="http://schemas.microsoft.com/office/drawing/2015/9/8/chartex" xmlns:cx2="http://schemas.microsoft.com/office/drawing/2015/10/21/chartex" xmlns:cx3="http://schemas.microsoft.com/office/drawing/2016/5/9/chartex" xmlns:cx4="http://schemas.microsoft.com/office/drawing/2016/5/10/chartex" xmlns:cx5="http://schemas.microsoft.com/office/drawing/2016/5/11/chartex" xmlns:cx6="http://schemas.microsoft.com/office/drawing/2016/5/12/chartex" xmlns:cx7="http://schemas.microsoft.com/office/drawing/2016/5/13/chartex" xmlns:cx8="http://schemas.microsoft.com/office/drawing/2016/5/14/chartex" xmlns:mc="http://schemas.openxmlformats.org/markup-compatibility/2006" xmlns:aink="http://schemas.microsoft.com/office/drawing/2016/ink" xmlns:am3d="http://schemas.microsoft.com/office/drawing/2017/model3d" xmlns:o="urn:schemas-microsoft-com:office:office" xmlns:oel="http://schemas.microsoft.com/office/2019/extlst" xmlns:r="http://schemas.openxmlformats.org/officeDocument/2006/relationships" xmlns:m="http://schemas.openxmlformats.org/officeDocument/2006/math" xmlns:v="urn:schemas-microsoft-com:vml" xmlns:wp14="http://schemas.microsoft.com/office/word/2010/wordprocessingDrawing" xmlns:wp="http://schemas.openxmlformats.org/drawingml/2006/wordprocessingDrawing" xmlns:w10="urn:schemas-microsoft-com:office:word" xmlns:w="http://schemas.openxmlformats.org/wordprocessingml/2006/main" xmlns:w14="http://schemas.microsoft.com/office/word/2010/wordml" xmlns:w15="http://schemas.microsoft.com/office/word/2012/wordml" xmlns:w16cex="http://schemas.microsoft.com/office/word/2018/wordml/cex" xmlns:w16cid="http://schemas.microsoft.com/office/word/2016/wordml/cid" xmlns:w16="http://schemas.microsoft.com/office/word/2018/wordml" xmlns:w16du="http://schemas.microsoft.com/office/word/2023/wordml/word16du" xmlns:w16sdtdh="http://schemas.microsoft.com/office/word/2020/wordml/sdtdatahash" xmlns:w16sdtfl="http://schemas.microsoft.com/office/word/2024/wordml/sdtformatlock" xmlns:w16se="http://schemas.microsoft.com/office/word/2015/wordml/symex" xmlns:wpg="http://schemas.microsoft.com/office/word/2010/wordprocessingGroup" xmlns:wpi="http://schemas.microsoft.com/office/word/2010/wordprocessingInk" xmlns:wne="http://schemas.microsoft.com/office/word/2006/wordml" xmlns:wps="http://schemas.microsoft.com/office/word/2010/wordprocessingShape" mc:Ignorable="w14 w15 w16se w16cid w16 w16cex w16sdtdh w16sdtfl w16du wp14">
   <w:body>
     <w:p>
       <w:pPr>
@@ -139,7 +139,21 @@
         <w:rPr>
           <w:rFonts w:ascii="Calibri" w:hAnsi="Calibri" w:cs="Calibri"/>
         </w:rPr>
-        <w:t>Install VSCode for creating '</w:t>
+        <w:t xml:space="preserve">Install </w:t>
+      </w:r>
+      <w:proofErr w:type="spellStart"/>
+      <w:r>
+        <w:rPr>
+          <w:rFonts w:ascii="Calibri" w:hAnsi="Calibri" w:cs="Calibri"/>
+        </w:rPr>
+        <w:t>VSCode</w:t>
+      </w:r>
+      <w:proofErr w:type="spellEnd"/>
+      <w:r>
+        <w:rPr>
+          <w:rFonts w:ascii="Calibri" w:hAnsi="Calibri" w:cs="Calibri"/>
+        </w:rPr>
+        <w:t xml:space="preserve"> for creating '</w:t>
       </w:r>
       <w:proofErr w:type="spellStart"/>
       <w:r>
@@ -678,7 +692,21 @@
         <w:rPr>
           <w:rFonts w:ascii="Calibri" w:hAnsi="Calibri" w:cs="Calibri"/>
         </w:rPr>
-        <w:t xml:space="preserve"> &amp; "C:/Program Files (x86)/Python/Python38-32/python.exe" -m </w:t>
+        <w:t xml:space="preserve"> &amp; "C:/Program Files (x</w:t>
+      </w:r>
+      <w:proofErr w:type="gramStart"/>
+      <w:r>
+        <w:rPr>
+          <w:rFonts w:ascii="Calibri" w:hAnsi="Calibri" w:cs="Calibri"/>
+        </w:rPr>
+        <w:t>86)/Python/Python38-32/python.exe</w:t>
+      </w:r>
+      <w:proofErr w:type="gramEnd"/>
+      <w:r>
+        <w:rPr>
+          <w:rFonts w:ascii="Calibri" w:hAnsi="Calibri" w:cs="Calibri"/>
+        </w:rPr>
+        <w:t xml:space="preserve">" -m </w:t>
       </w:r>
       <w:proofErr w:type="spellStart"/>
       <w:r>
@@ -1000,7 +1028,67 @@
           <w:sz w:val="21"/>
           <w:szCs w:val="21"/>
         </w:rPr>
-        <w:t>/xhtml+xml,application/xml; q=0.9,*/*;q=0.8'</w:t>
+        <w:t>/xhtml+</w:t>
+      </w:r>
+      <w:proofErr w:type="gramStart"/>
+      <w:r>
+        <w:rPr>
+          <w:rFonts w:ascii="Consolas" w:hAnsi="Consolas" w:cs="Calibri"/>
+          <w:color w:val="CB8F76"/>
+          <w:sz w:val="21"/>
+          <w:szCs w:val="21"/>
+        </w:rPr>
+        <w:t>xml,application</w:t>
+      </w:r>
+      <w:proofErr w:type="gramEnd"/>
+      <w:r>
+        <w:rPr>
+          <w:rFonts w:ascii="Consolas" w:hAnsi="Consolas" w:cs="Calibri"/>
+          <w:color w:val="CB8F76"/>
+          <w:sz w:val="21"/>
+          <w:szCs w:val="21"/>
+        </w:rPr>
+        <w:t>/xml; q=0.</w:t>
+      </w:r>
+      <w:proofErr w:type="gramStart"/>
+      <w:r>
+        <w:rPr>
+          <w:rFonts w:ascii="Consolas" w:hAnsi="Consolas" w:cs="Calibri"/>
+          <w:color w:val="CB8F76"/>
+          <w:sz w:val="21"/>
+          <w:szCs w:val="21"/>
+        </w:rPr>
+        <w:t>9,*</w:t>
+      </w:r>
+      <w:proofErr w:type="gramEnd"/>
+      <w:r>
+        <w:rPr>
+          <w:rFonts w:ascii="Consolas" w:hAnsi="Consolas" w:cs="Calibri"/>
+          <w:color w:val="CB8F76"/>
+          <w:sz w:val="21"/>
+          <w:szCs w:val="21"/>
+        </w:rPr>
+        <w:t>/</w:t>
+      </w:r>
+      <w:proofErr w:type="gramStart"/>
+      <w:r>
+        <w:rPr>
+          <w:rFonts w:ascii="Consolas" w:hAnsi="Consolas" w:cs="Calibri"/>
+          <w:color w:val="CB8F76"/>
+          <w:sz w:val="21"/>
+          <w:szCs w:val="21"/>
+        </w:rPr>
+        <w:t>*;q</w:t>
+      </w:r>
+      <w:proofErr w:type="gramEnd"/>
+      <w:r>
+        <w:rPr>
+          <w:rFonts w:ascii="Consolas" w:hAnsi="Consolas" w:cs="Calibri"/>
+          <w:color w:val="CB8F76"/>
+          <w:sz w:val="21"/>
+          <w:szCs w:val="21"/>
+        </w:rPr>
+        <w:t>=0.8'</w:t>
       </w:r>
       <w:r>
         <w:rPr>
@@ -1116,7 +1204,7 @@
           <w:sz w:val="21"/>
           <w:szCs w:val="21"/>
         </w:rPr>
-        <w:t>'accept-language</w:t>
+        <w:t>'</w:t>
       </w:r>
       <w:proofErr w:type="gramStart"/>
       <w:r>
@@ -1126,6 +1214,26 @@
           <w:sz w:val="21"/>
           <w:szCs w:val="21"/>
         </w:rPr>
+        <w:t>accept</w:t>
+      </w:r>
+      <w:proofErr w:type="gramEnd"/>
+      <w:r>
+        <w:rPr>
+          <w:rFonts w:ascii="Consolas" w:hAnsi="Consolas" w:cs="Calibri"/>
+          <w:color w:val="CB8F76"/>
+          <w:sz w:val="21"/>
+          <w:szCs w:val="21"/>
+        </w:rPr>
+        <w:t>-language</w:t>
+      </w:r>
+      <w:proofErr w:type="gramStart"/>
+      <w:r>
+        <w:rPr>
+          <w:rFonts w:ascii="Consolas" w:hAnsi="Consolas" w:cs="Calibri"/>
+          <w:color w:val="CB8F76"/>
+          <w:sz w:val="21"/>
+          <w:szCs w:val="21"/>
+        </w:rPr>
         <w:t>'</w:t>
       </w:r>
       <w:r>
@@ -1324,7 +1432,7 @@
         </w:rPr>
         <w:t>(</w:t>
       </w:r>
-      <w:proofErr w:type="gramEnd"/>
+      <w:proofErr w:type="spellStart"/>
       <w:r>
         <w:rPr>
           <w:rFonts w:ascii="Consolas" w:hAnsi="Consolas" w:cs="Calibri"/>
@@ -1332,7 +1440,17 @@
           <w:sz w:val="21"/>
           <w:szCs w:val="21"/>
         </w:rPr>
-        <w:t>url,  </w:t>
+        <w:t>url</w:t>
+      </w:r>
+      <w:proofErr w:type="spellEnd"/>
+      <w:r>
+        <w:rPr>
+          <w:rFonts w:ascii="Consolas" w:hAnsi="Consolas" w:cs="Calibri"/>
+          <w:color w:val="979797"/>
+          <w:sz w:val="21"/>
+          <w:szCs w:val="21"/>
+        </w:rPr>
+        <w:t>,  </w:t>
       </w:r>
       <w:r>
         <w:rPr>
@@ -1343,6 +1461,7 @@
         </w:rPr>
         <w:t>headers</w:t>
       </w:r>
+      <w:proofErr w:type="gramEnd"/>
       <w:r>
         <w:rPr>
           <w:rFonts w:ascii="Consolas" w:hAnsi="Consolas" w:cs="Calibri"/>
@@ -1409,7 +1528,7 @@
         </w:rPr>
         <w:lastRenderedPageBreak/>
         <w:drawing>
-          <wp:inline distT="0" distB="0" distL="0" distR="0" wp14:anchorId="5D9618CE" wp14:editId="5052BF45">
+          <wp:inline distT="0" distB="0" distL="0" distR="0" wp14:anchorId="5D9618CE" wp14:editId="41F1201A">
             <wp:extent cx="5943600" cy="1272540"/>
             <wp:effectExtent l="0" t="0" r="0" b="3810"/>
             <wp:docPr id="10" name="Picture 10" descr="C:\Users\admin\AppData\Local\Microsoft\Windows\INetCache\Content.MSO\CBD63FED.tmp"/>
@@ -2016,8 +2135,16 @@
         <w:rPr>
           <w:rFonts w:ascii="Calibri" w:hAnsi="Calibri" w:cs="Calibri"/>
         </w:rPr>
-        <w:t xml:space="preserve"> Files (x86)\Python\Python38-32\Lib</w:t>
-      </w:r>
+        <w:t xml:space="preserve"> Files (x</w:t>
+      </w:r>
+      <w:proofErr w:type="gramStart"/>
+      <w:r>
+        <w:rPr>
+          <w:rFonts w:ascii="Calibri" w:hAnsi="Calibri" w:cs="Calibri"/>
+        </w:rPr>
+        <w:t>86)\Python\Python38-32\Lib</w:t>
+      </w:r>
+      <w:proofErr w:type="gramEnd"/>
     </w:p>
     <w:p>
       <w:pPr>
@@ -2374,6 +2501,1183 @@
     </w:p>
     <w:p>
       <w:pPr>
+        <w:rPr>
+          <w:rFonts w:ascii="Calibri" w:eastAsia="Times New Roman" w:hAnsi="Calibri" w:cs="Calibri"/>
+        </w:rPr>
+      </w:pPr>
+      <w:r>
+        <w:rPr>
+          <w:rFonts w:ascii="Calibri" w:hAnsi="Calibri" w:cs="Calibri"/>
+        </w:rPr>
+        <w:br w:type="page"/>
+      </w:r>
+    </w:p>
+    <w:p>
+      <w:pPr>
+        <w:pStyle w:val="NormalWeb"/>
+        <w:spacing w:before="0" w:beforeAutospacing="0" w:after="0" w:afterAutospacing="0"/>
+        <w:rPr>
+          <w:rFonts w:ascii="Calibri" w:hAnsi="Calibri" w:cs="Calibri"/>
+          <w:sz w:val="22"/>
+          <w:szCs w:val="22"/>
+        </w:rPr>
+      </w:pPr>
+    </w:p>
+    <w:p>
+      <w:pPr>
+        <w:pStyle w:val="NormalWeb"/>
+        <w:spacing w:before="0" w:beforeAutospacing="0" w:after="0" w:afterAutospacing="0"/>
+        <w:rPr>
+          <w:rFonts w:ascii="Lucida Grande" w:hAnsi="Lucida Grande" w:cs="Calibri"/>
+          <w:color w:val="222222"/>
+        </w:rPr>
+      </w:pPr>
+      <w:r>
+        <w:rPr>
+          <w:rFonts w:ascii="Lucida Grande" w:hAnsi="Lucida Grande" w:cs="Calibri"/>
+          <w:b/>
+          <w:bCs/>
+          <w:color w:val="222222"/>
+          <w:shd w:val="clear" w:color="auto" w:fill="FFFFFF"/>
+        </w:rPr>
+        <w:t xml:space="preserve">Python &amp; Microsoft </w:t>
+      </w:r>
+      <w:r>
+        <w:rPr>
+          <w:rFonts w:ascii="Lucida Grande" w:hAnsi="Lucida Grande" w:cs="Calibri"/>
+          <w:b/>
+          <w:bCs/>
+          <w:color w:val="222222"/>
+          <w:shd w:val="clear" w:color="auto" w:fill="FFFFFF"/>
+        </w:rPr>
+        <w:t xml:space="preserve">MS </w:t>
+      </w:r>
+      <w:proofErr w:type="gramStart"/>
+      <w:r>
+        <w:rPr>
+          <w:rFonts w:ascii="Lucida Grande" w:hAnsi="Lucida Grande" w:cs="Calibri"/>
+          <w:b/>
+          <w:bCs/>
+          <w:color w:val="222222"/>
+          <w:shd w:val="clear" w:color="auto" w:fill="FFFFFF"/>
+        </w:rPr>
+        <w:t>SQL :</w:t>
+      </w:r>
+      <w:proofErr w:type="gramEnd"/>
+    </w:p>
+    <w:p>
+      <w:pPr>
+        <w:numPr>
+          <w:ilvl w:val="0"/>
+          <w:numId w:val="19"/>
+        </w:numPr>
+        <w:spacing w:after="0" w:line="240" w:lineRule="auto"/>
+        <w:ind w:left="540"/>
+        <w:textAlignment w:val="center"/>
+        <w:rPr>
+          <w:rFonts w:ascii="Calibri" w:hAnsi="Calibri" w:cs="Calibri"/>
+          <w:color w:val="222222"/>
+        </w:rPr>
+      </w:pPr>
+      <w:r>
+        <w:rPr>
+          <w:rFonts w:ascii="Calibri" w:hAnsi="Calibri" w:cs="Calibri"/>
+          <w:color w:val="222222"/>
+          <w:shd w:val="clear" w:color="auto" w:fill="FFFFFF"/>
+        </w:rPr>
+        <w:t xml:space="preserve">Install Python </w:t>
+      </w:r>
+      <w:r>
+        <w:rPr>
+          <w:rFonts w:ascii="Calibri" w:hAnsi="Calibri" w:cs="Calibri"/>
+          <w:color w:val="222222"/>
+          <w:shd w:val="clear" w:color="auto" w:fill="FFFFFF"/>
+        </w:rPr>
+        <w:t xml:space="preserve">Modules </w:t>
+      </w:r>
+    </w:p>
+    <w:p>
+      <w:pPr>
+        <w:numPr>
+          <w:ilvl w:val="1"/>
+          <w:numId w:val="19"/>
+        </w:numPr>
+        <w:spacing w:after="0" w:line="240" w:lineRule="auto"/>
+        <w:textAlignment w:val="center"/>
+        <w:rPr>
+          <w:rFonts w:ascii="Calibri" w:hAnsi="Calibri" w:cs="Calibri"/>
+          <w:color w:val="222222"/>
+        </w:rPr>
+      </w:pPr>
+      <w:r>
+        <w:rPr>
+          <w:rFonts w:ascii="Calibri" w:hAnsi="Calibri" w:cs="Calibri"/>
+          <w:color w:val="222222"/>
+          <w:shd w:val="clear" w:color="auto" w:fill="FFFFFF"/>
+        </w:rPr>
+        <w:t>python.exe -m pip install –upgrade pip</w:t>
+      </w:r>
+    </w:p>
+    <w:p>
+      <w:pPr>
+        <w:numPr>
+          <w:ilvl w:val="1"/>
+          <w:numId w:val="19"/>
+        </w:numPr>
+        <w:spacing w:after="0" w:line="240" w:lineRule="auto"/>
+        <w:textAlignment w:val="center"/>
+        <w:rPr>
+          <w:rFonts w:ascii="Calibri" w:hAnsi="Calibri" w:cs="Calibri"/>
+          <w:color w:val="222222"/>
+        </w:rPr>
+      </w:pPr>
+      <w:proofErr w:type="spellStart"/>
+      <w:r>
+        <w:rPr>
+          <w:rFonts w:ascii="Calibri" w:hAnsi="Calibri" w:cs="Calibri"/>
+          <w:color w:val="222222"/>
+        </w:rPr>
+        <w:t>py</w:t>
+      </w:r>
+      <w:proofErr w:type="spellEnd"/>
+      <w:r>
+        <w:rPr>
+          <w:rFonts w:ascii="Calibri" w:hAnsi="Calibri" w:cs="Calibri"/>
+          <w:color w:val="222222"/>
+        </w:rPr>
+        <w:t xml:space="preserve"> -m pip install requests</w:t>
+      </w:r>
+      <w:r>
+        <w:rPr>
+          <w:rFonts w:ascii="Calibri" w:hAnsi="Calibri" w:cs="Calibri"/>
+          <w:color w:val="222222"/>
+        </w:rPr>
+        <w:t xml:space="preserve"> </w:t>
+      </w:r>
+    </w:p>
+    <w:p>
+      <w:pPr>
+        <w:numPr>
+          <w:ilvl w:val="1"/>
+          <w:numId w:val="19"/>
+        </w:numPr>
+        <w:spacing w:after="0" w:line="240" w:lineRule="auto"/>
+        <w:textAlignment w:val="center"/>
+        <w:rPr>
+          <w:rFonts w:ascii="Calibri" w:hAnsi="Calibri" w:cs="Calibri"/>
+          <w:color w:val="222222"/>
+        </w:rPr>
+      </w:pPr>
+      <w:r>
+        <w:rPr>
+          <w:rFonts w:ascii="Calibri" w:hAnsi="Calibri" w:cs="Calibri"/>
+          <w:color w:val="222222"/>
+        </w:rPr>
+        <w:t xml:space="preserve">pip install </w:t>
+      </w:r>
+      <w:proofErr w:type="spellStart"/>
+      <w:r>
+        <w:rPr>
+          <w:rFonts w:ascii="Calibri" w:hAnsi="Calibri" w:cs="Calibri"/>
+          <w:color w:val="222222"/>
+        </w:rPr>
+        <w:t>mssql</w:t>
+      </w:r>
+      <w:proofErr w:type="spellEnd"/>
+      <w:r>
+        <w:rPr>
+          <w:rFonts w:ascii="Calibri" w:hAnsi="Calibri" w:cs="Calibri"/>
+          <w:color w:val="222222"/>
+        </w:rPr>
+        <w:t>-python</w:t>
+      </w:r>
+    </w:p>
+    <w:p>
+      <w:pPr>
+        <w:numPr>
+          <w:ilvl w:val="1"/>
+          <w:numId w:val="19"/>
+        </w:numPr>
+        <w:spacing w:after="0" w:line="240" w:lineRule="auto"/>
+        <w:textAlignment w:val="center"/>
+        <w:rPr>
+          <w:rFonts w:ascii="Calibri" w:hAnsi="Calibri" w:cs="Calibri"/>
+          <w:color w:val="222222"/>
+        </w:rPr>
+      </w:pPr>
+      <w:r>
+        <w:rPr>
+          <w:rFonts w:ascii="Calibri" w:hAnsi="Calibri" w:cs="Calibri"/>
+          <w:color w:val="222222"/>
+        </w:rPr>
+        <w:t>pip install pyodbc</w:t>
+      </w:r>
+      <w:r>
+        <w:rPr>
+          <w:rFonts w:ascii="Calibri" w:hAnsi="Calibri" w:cs="Calibri"/>
+          <w:color w:val="222222"/>
+        </w:rPr>
+        <w:t xml:space="preserve"> </w:t>
+      </w:r>
+      <w:r>
+        <w:rPr>
+          <w:rFonts w:ascii="Calibri" w:hAnsi="Calibri" w:cs="Calibri"/>
+          <w:color w:val="222222"/>
+        </w:rPr>
+        <w:tab/>
+      </w:r>
+      <w:r>
+        <w:rPr>
+          <w:rFonts w:ascii="Calibri" w:hAnsi="Calibri" w:cs="Calibri"/>
+          <w:color w:val="222222"/>
+        </w:rPr>
+        <w:t>###</w:t>
+      </w:r>
+      <w:proofErr w:type="gramStart"/>
+      <w:r>
+        <w:rPr>
+          <w:rFonts w:ascii="Calibri" w:hAnsi="Calibri" w:cs="Calibri"/>
+          <w:color w:val="222222"/>
+        </w:rPr>
+        <w:t>KP :</w:t>
+      </w:r>
+      <w:proofErr w:type="gramEnd"/>
+      <w:r>
+        <w:rPr>
+          <w:rFonts w:ascii="Calibri" w:hAnsi="Calibri" w:cs="Calibri"/>
+          <w:color w:val="222222"/>
+        </w:rPr>
+        <w:t xml:space="preserve"> </w:t>
+      </w:r>
+      <w:r>
+        <w:rPr>
+          <w:rFonts w:ascii="Calibri" w:hAnsi="Calibri" w:cs="Calibri"/>
+          <w:color w:val="222222"/>
+        </w:rPr>
+        <w:t xml:space="preserve">PYODBC </w:t>
+      </w:r>
+      <w:r>
+        <w:rPr>
+          <w:rFonts w:ascii="Calibri" w:hAnsi="Calibri" w:cs="Calibri"/>
+          <w:color w:val="222222"/>
+        </w:rPr>
+        <w:t>Module to</w:t>
+      </w:r>
+      <w:r>
+        <w:rPr>
+          <w:rFonts w:ascii="Calibri" w:hAnsi="Calibri" w:cs="Calibri"/>
+          <w:color w:val="222222"/>
+        </w:rPr>
+        <w:t xml:space="preserve"> connect to the MSSQL Servers</w:t>
+      </w:r>
+    </w:p>
+    <w:p>
+      <w:pPr>
+        <w:numPr>
+          <w:ilvl w:val="1"/>
+          <w:numId w:val="19"/>
+        </w:numPr>
+        <w:spacing w:after="0" w:line="240" w:lineRule="auto"/>
+        <w:textAlignment w:val="center"/>
+        <w:rPr>
+          <w:rFonts w:ascii="Calibri" w:hAnsi="Calibri" w:cs="Calibri"/>
+          <w:color w:val="222222"/>
+        </w:rPr>
+      </w:pPr>
+      <w:r>
+        <w:rPr>
+          <w:rFonts w:ascii="Calibri" w:hAnsi="Calibri" w:cs="Calibri"/>
+          <w:color w:val="222222"/>
+        </w:rPr>
+        <w:t>pip install python-</w:t>
+      </w:r>
+      <w:proofErr w:type="spellStart"/>
+      <w:r>
+        <w:rPr>
+          <w:rFonts w:ascii="Calibri" w:hAnsi="Calibri" w:cs="Calibri"/>
+          <w:color w:val="222222"/>
+        </w:rPr>
+        <w:t>dotenv</w:t>
+      </w:r>
+      <w:proofErr w:type="spellEnd"/>
+    </w:p>
+    <w:p>
+      <w:pPr>
+        <w:numPr>
+          <w:ilvl w:val="1"/>
+          <w:numId w:val="19"/>
+        </w:numPr>
+        <w:spacing w:after="0" w:line="240" w:lineRule="auto"/>
+        <w:textAlignment w:val="center"/>
+        <w:rPr>
+          <w:rFonts w:ascii="Calibri" w:hAnsi="Calibri" w:cs="Calibri"/>
+          <w:color w:val="222222"/>
+        </w:rPr>
+      </w:pPr>
+      <w:r>
+        <w:rPr>
+          <w:rFonts w:ascii="Calibri" w:hAnsi="Calibri" w:cs="Calibri"/>
+          <w:color w:val="222222"/>
+        </w:rPr>
+        <w:t xml:space="preserve">pip install </w:t>
+      </w:r>
+      <w:proofErr w:type="spellStart"/>
+      <w:proofErr w:type="gramStart"/>
+      <w:r>
+        <w:rPr>
+          <w:rFonts w:ascii="Calibri" w:hAnsi="Calibri" w:cs="Calibri"/>
+          <w:color w:val="222222"/>
+        </w:rPr>
+        <w:t>uvicorn</w:t>
+      </w:r>
+      <w:proofErr w:type="spellEnd"/>
+      <w:r>
+        <w:rPr>
+          <w:rFonts w:ascii="Calibri" w:hAnsi="Calibri" w:cs="Calibri"/>
+          <w:color w:val="222222"/>
+        </w:rPr>
+        <w:t xml:space="preserve">  </w:t>
+      </w:r>
+      <w:r>
+        <w:rPr>
+          <w:rFonts w:ascii="Calibri" w:hAnsi="Calibri" w:cs="Calibri"/>
+          <w:color w:val="222222"/>
+        </w:rPr>
+        <w:tab/>
+      </w:r>
+      <w:proofErr w:type="gramEnd"/>
+      <w:r>
+        <w:rPr>
+          <w:rFonts w:ascii="Calibri" w:hAnsi="Calibri" w:cs="Calibri"/>
+          <w:color w:val="222222"/>
+        </w:rPr>
+        <w:t>###</w:t>
+      </w:r>
+      <w:proofErr w:type="gramStart"/>
+      <w:r>
+        <w:rPr>
+          <w:rFonts w:ascii="Calibri" w:hAnsi="Calibri" w:cs="Calibri"/>
+          <w:color w:val="222222"/>
+        </w:rPr>
+        <w:t>KP :</w:t>
+      </w:r>
+      <w:proofErr w:type="gramEnd"/>
+      <w:r>
+        <w:rPr>
+          <w:rFonts w:ascii="Calibri" w:hAnsi="Calibri" w:cs="Calibri"/>
+          <w:color w:val="222222"/>
+        </w:rPr>
+        <w:t xml:space="preserve"> Modules to install and host the Python </w:t>
+      </w:r>
+      <w:proofErr w:type="spellStart"/>
+      <w:r>
+        <w:rPr>
+          <w:rFonts w:ascii="Calibri" w:hAnsi="Calibri" w:cs="Calibri"/>
+          <w:color w:val="222222"/>
+        </w:rPr>
+        <w:t>WebAPIs</w:t>
+      </w:r>
+      <w:proofErr w:type="spellEnd"/>
+    </w:p>
+    <w:p>
+      <w:pPr>
+        <w:numPr>
+          <w:ilvl w:val="1"/>
+          <w:numId w:val="19"/>
+        </w:numPr>
+        <w:spacing w:after="0" w:line="240" w:lineRule="auto"/>
+        <w:textAlignment w:val="center"/>
+        <w:rPr>
+          <w:rFonts w:ascii="Calibri" w:hAnsi="Calibri" w:cs="Calibri"/>
+          <w:color w:val="222222"/>
+        </w:rPr>
+      </w:pPr>
+      <w:r>
+        <w:rPr>
+          <w:rFonts w:ascii="Calibri" w:hAnsi="Calibri" w:cs="Calibri"/>
+          <w:color w:val="222222"/>
+        </w:rPr>
+        <w:t xml:space="preserve">pip install </w:t>
+      </w:r>
+      <w:proofErr w:type="spellStart"/>
+      <w:r>
+        <w:rPr>
+          <w:rFonts w:ascii="Calibri" w:hAnsi="Calibri" w:cs="Calibri"/>
+          <w:color w:val="222222"/>
+        </w:rPr>
+        <w:t>simplejson</w:t>
+      </w:r>
+      <w:proofErr w:type="spellEnd"/>
+      <w:r>
+        <w:rPr>
+          <w:rFonts w:ascii="Calibri" w:hAnsi="Calibri" w:cs="Calibri"/>
+          <w:color w:val="222222"/>
+        </w:rPr>
+        <w:t xml:space="preserve"> </w:t>
+      </w:r>
+      <w:r>
+        <w:rPr>
+          <w:rFonts w:ascii="Calibri" w:hAnsi="Calibri" w:cs="Calibri"/>
+          <w:color w:val="222222"/>
+        </w:rPr>
+        <w:tab/>
+        <w:t>###</w:t>
+      </w:r>
+      <w:proofErr w:type="gramStart"/>
+      <w:r>
+        <w:rPr>
+          <w:rFonts w:ascii="Calibri" w:hAnsi="Calibri" w:cs="Calibri"/>
+          <w:color w:val="222222"/>
+        </w:rPr>
+        <w:t>KP :</w:t>
+      </w:r>
+      <w:proofErr w:type="gramEnd"/>
+      <w:r>
+        <w:rPr>
+          <w:rFonts w:ascii="Calibri" w:hAnsi="Calibri" w:cs="Calibri"/>
+          <w:color w:val="222222"/>
+        </w:rPr>
+        <w:t xml:space="preserve"> Modules to install </w:t>
+      </w:r>
+      <w:proofErr w:type="spellStart"/>
+      <w:r>
+        <w:rPr>
+          <w:rFonts w:ascii="Calibri" w:hAnsi="Calibri" w:cs="Calibri"/>
+          <w:color w:val="222222"/>
+        </w:rPr>
+        <w:t>json</w:t>
+      </w:r>
+      <w:proofErr w:type="spellEnd"/>
+      <w:r>
+        <w:rPr>
+          <w:rFonts w:ascii="Calibri" w:hAnsi="Calibri" w:cs="Calibri"/>
+          <w:color w:val="222222"/>
+        </w:rPr>
+        <w:t xml:space="preserve"> (JavaScript Object Notation)</w:t>
+      </w:r>
+    </w:p>
+    <w:p>
+      <w:pPr>
+        <w:numPr>
+          <w:ilvl w:val="1"/>
+          <w:numId w:val="19"/>
+        </w:numPr>
+        <w:spacing w:after="0" w:line="240" w:lineRule="auto"/>
+        <w:textAlignment w:val="center"/>
+        <w:rPr>
+          <w:rFonts w:ascii="Calibri" w:hAnsi="Calibri" w:cs="Calibri"/>
+          <w:color w:val="222222"/>
+        </w:rPr>
+      </w:pPr>
+      <w:r>
+        <w:rPr>
+          <w:rFonts w:ascii="Calibri" w:hAnsi="Calibri" w:cs="Calibri"/>
+          <w:color w:val="222222"/>
+        </w:rPr>
+        <w:t>pip install pandas</w:t>
+      </w:r>
+      <w:r>
+        <w:rPr>
+          <w:rFonts w:ascii="Calibri" w:hAnsi="Calibri" w:cs="Calibri"/>
+          <w:color w:val="222222"/>
+        </w:rPr>
+        <w:tab/>
+      </w:r>
+    </w:p>
+    <w:p>
+      <w:pPr>
+        <w:numPr>
+          <w:ilvl w:val="0"/>
+          <w:numId w:val="19"/>
+        </w:numPr>
+        <w:spacing w:after="0" w:line="240" w:lineRule="auto"/>
+        <w:ind w:left="540"/>
+        <w:textAlignment w:val="center"/>
+        <w:rPr>
+          <w:rFonts w:ascii="Calibri" w:hAnsi="Calibri" w:cs="Calibri"/>
+          <w:color w:val="222222"/>
+        </w:rPr>
+      </w:pPr>
+      <w:r>
+        <w:rPr>
+          <w:rFonts w:ascii="Calibri" w:hAnsi="Calibri" w:cs="Calibri"/>
+          <w:color w:val="222222"/>
+          <w:shd w:val="clear" w:color="auto" w:fill="FFFFFF"/>
+        </w:rPr>
+        <w:t xml:space="preserve">Install Python </w:t>
+      </w:r>
+      <w:r>
+        <w:rPr>
+          <w:rFonts w:ascii="Calibri" w:hAnsi="Calibri" w:cs="Calibri"/>
+          <w:color w:val="222222"/>
+          <w:shd w:val="clear" w:color="auto" w:fill="FFFFFF"/>
+        </w:rPr>
+        <w:t>ODBC (OpenDataBaseConnection</w:t>
+      </w:r>
+      <w:proofErr w:type="gramStart"/>
+      <w:r>
+        <w:rPr>
+          <w:rFonts w:ascii="Calibri" w:hAnsi="Calibri" w:cs="Calibri"/>
+          <w:color w:val="222222"/>
+          <w:shd w:val="clear" w:color="auto" w:fill="FFFFFF"/>
+        </w:rPr>
+        <w:t>) :</w:t>
+      </w:r>
+      <w:proofErr w:type="gramEnd"/>
+      <w:r>
+        <w:rPr>
+          <w:rFonts w:ascii="Calibri" w:hAnsi="Calibri" w:cs="Calibri"/>
+          <w:color w:val="222222"/>
+          <w:shd w:val="clear" w:color="auto" w:fill="FFFFFF"/>
+        </w:rPr>
+        <w:t xml:space="preserve"> pip install pyodbc</w:t>
+      </w:r>
+    </w:p>
+    <w:p>
+      <w:pPr>
+        <w:numPr>
+          <w:ilvl w:val="0"/>
+          <w:numId w:val="19"/>
+        </w:numPr>
+        <w:spacing w:after="0" w:line="240" w:lineRule="auto"/>
+        <w:ind w:left="540"/>
+        <w:textAlignment w:val="center"/>
+        <w:rPr>
+          <w:rFonts w:ascii="Calibri" w:hAnsi="Calibri" w:cs="Calibri"/>
+          <w:color w:val="222222"/>
+        </w:rPr>
+      </w:pPr>
+      <w:r>
+        <w:rPr>
+          <w:rFonts w:ascii="Calibri" w:hAnsi="Calibri" w:cs="Calibri"/>
+          <w:color w:val="222222"/>
+        </w:rPr>
+        <w:drawing>
+          <wp:inline distT="0" distB="0" distL="0" distR="0" wp14:anchorId="49DB51A8" wp14:editId="6300A994">
+            <wp:extent cx="5943600" cy="2828925"/>
+            <wp:effectExtent l="0" t="0" r="0" b="9525"/>
+            <wp:docPr id="1192986371" name="Picture 1"/>
+            <wp:cNvGraphicFramePr>
+              <a:graphicFrameLocks xmlns:a="http://schemas.openxmlformats.org/drawingml/2006/main" noChangeAspect="1"/>
+            </wp:cNvGraphicFramePr>
+            <a:graphic xmlns:a="http://schemas.openxmlformats.org/drawingml/2006/main">
+              <a:graphicData uri="http://schemas.openxmlformats.org/drawingml/2006/picture">
+                <pic:pic xmlns:pic="http://schemas.openxmlformats.org/drawingml/2006/picture">
+                  <pic:nvPicPr>
+                    <pic:cNvPr id="1192986371" name=""/>
+                    <pic:cNvPicPr/>
+                  </pic:nvPicPr>
+                  <pic:blipFill>
+                    <a:blip r:embed="rId18"/>
+                    <a:stretch>
+                      <a:fillRect/>
+                    </a:stretch>
+                  </pic:blipFill>
+                  <pic:spPr>
+                    <a:xfrm>
+                      <a:off x="0" y="0"/>
+                      <a:ext cx="5943600" cy="2828925"/>
+                    </a:xfrm>
+                    <a:prstGeom prst="rect">
+                      <a:avLst/>
+                    </a:prstGeom>
+                  </pic:spPr>
+                </pic:pic>
+              </a:graphicData>
+            </a:graphic>
+          </wp:inline>
+        </w:drawing>
+      </w:r>
+    </w:p>
+    <w:p>
+      <w:pPr>
+        <w:pStyle w:val="NormalWeb"/>
+        <w:numPr>
+          <w:ilvl w:val="0"/>
+          <w:numId w:val="19"/>
+        </w:numPr>
+        <w:spacing w:before="0" w:beforeAutospacing="0" w:after="0" w:afterAutospacing="0"/>
+        <w:rPr>
+          <w:rFonts w:ascii="Calibri" w:hAnsi="Calibri" w:cs="Calibri"/>
+          <w:sz w:val="22"/>
+          <w:szCs w:val="22"/>
+        </w:rPr>
+      </w:pPr>
+      <w:r>
+        <w:rPr>
+          <w:rFonts w:ascii="Calibri" w:hAnsi="Calibri" w:cs="Calibri"/>
+          <w:sz w:val="22"/>
+          <w:szCs w:val="22"/>
+        </w:rPr>
+        <w:t xml:space="preserve">Run </w:t>
+      </w:r>
+      <w:proofErr w:type="gramStart"/>
+      <w:r>
+        <w:rPr>
+          <w:rFonts w:ascii="Calibri" w:hAnsi="Calibri" w:cs="Calibri"/>
+          <w:sz w:val="22"/>
+          <w:szCs w:val="22"/>
+        </w:rPr>
+        <w:t>Script :</w:t>
+      </w:r>
+      <w:proofErr w:type="gramEnd"/>
+      <w:r>
+        <w:rPr>
+          <w:rFonts w:ascii="Calibri" w:hAnsi="Calibri" w:cs="Calibri"/>
+          <w:sz w:val="22"/>
+          <w:szCs w:val="22"/>
+        </w:rPr>
+        <w:t xml:space="preserve"> python mssqlcon.py </w:t>
+      </w:r>
+    </w:p>
+    <w:p>
+      <w:pPr>
+        <w:pStyle w:val="NormalWeb"/>
+        <w:numPr>
+          <w:ilvl w:val="0"/>
+          <w:numId w:val="19"/>
+        </w:numPr>
+        <w:spacing w:before="0" w:beforeAutospacing="0" w:after="0" w:afterAutospacing="0"/>
+        <w:rPr>
+          <w:rFonts w:ascii="Calibri" w:hAnsi="Calibri" w:cs="Calibri"/>
+          <w:sz w:val="22"/>
+          <w:szCs w:val="22"/>
+        </w:rPr>
+      </w:pPr>
+      <w:r>
+        <w:rPr>
+          <w:rFonts w:ascii="Calibri" w:hAnsi="Calibri" w:cs="Calibri"/>
+          <w:sz w:val="22"/>
+          <w:szCs w:val="22"/>
+        </w:rPr>
+        <w:drawing>
+          <wp:inline distT="0" distB="0" distL="0" distR="0" wp14:anchorId="538DE8C1" wp14:editId="6A46292B">
+            <wp:extent cx="5943600" cy="3084830"/>
+            <wp:effectExtent l="0" t="0" r="0" b="1270"/>
+            <wp:docPr id="1278861323" name="Picture 1"/>
+            <wp:cNvGraphicFramePr>
+              <a:graphicFrameLocks xmlns:a="http://schemas.openxmlformats.org/drawingml/2006/main" noChangeAspect="1"/>
+            </wp:cNvGraphicFramePr>
+            <a:graphic xmlns:a="http://schemas.openxmlformats.org/drawingml/2006/main">
+              <a:graphicData uri="http://schemas.openxmlformats.org/drawingml/2006/picture">
+                <pic:pic xmlns:pic="http://schemas.openxmlformats.org/drawingml/2006/picture">
+                  <pic:nvPicPr>
+                    <pic:cNvPr id="1278861323" name=""/>
+                    <pic:cNvPicPr/>
+                  </pic:nvPicPr>
+                  <pic:blipFill>
+                    <a:blip r:embed="rId19"/>
+                    <a:stretch>
+                      <a:fillRect/>
+                    </a:stretch>
+                  </pic:blipFill>
+                  <pic:spPr>
+                    <a:xfrm>
+                      <a:off x="0" y="0"/>
+                      <a:ext cx="5943600" cy="3084830"/>
+                    </a:xfrm>
+                    <a:prstGeom prst="rect">
+                      <a:avLst/>
+                    </a:prstGeom>
+                  </pic:spPr>
+                </pic:pic>
+              </a:graphicData>
+            </a:graphic>
+          </wp:inline>
+        </w:drawing>
+      </w:r>
+    </w:p>
+    <w:p>
+      <w:pPr>
+        <w:pStyle w:val="NormalWeb"/>
+        <w:numPr>
+          <w:ilvl w:val="0"/>
+          <w:numId w:val="19"/>
+        </w:numPr>
+        <w:spacing w:after="0"/>
+        <w:rPr>
+          <w:rFonts w:ascii="Calibri" w:hAnsi="Calibri" w:cs="Calibri"/>
+          <w:sz w:val="16"/>
+          <w:szCs w:val="16"/>
+        </w:rPr>
+      </w:pPr>
+      <w:proofErr w:type="gramStart"/>
+      <w:r>
+        <w:rPr>
+          <w:rFonts w:ascii="Calibri" w:hAnsi="Calibri" w:cs="Calibri"/>
+          <w:sz w:val="22"/>
+          <w:szCs w:val="22"/>
+        </w:rPr>
+        <w:lastRenderedPageBreak/>
+        <w:t xml:space="preserve">Run </w:t>
+      </w:r>
+      <w:r>
+        <w:rPr>
+          <w:rFonts w:ascii="Calibri" w:hAnsi="Calibri" w:cs="Calibri"/>
+          <w:sz w:val="22"/>
+          <w:szCs w:val="22"/>
+        </w:rPr>
+        <w:t>:</w:t>
+      </w:r>
+      <w:proofErr w:type="gramEnd"/>
+      <w:r>
+        <w:rPr>
+          <w:rFonts w:ascii="Calibri" w:hAnsi="Calibri" w:cs="Calibri"/>
+          <w:sz w:val="22"/>
+          <w:szCs w:val="22"/>
+        </w:rPr>
+        <w:t xml:space="preserve"> </w:t>
+      </w:r>
+      <w:r>
+        <w:rPr>
+          <w:rFonts w:ascii="Calibri" w:hAnsi="Calibri" w:cs="Calibri"/>
+          <w:b/>
+          <w:bCs/>
+          <w:sz w:val="16"/>
+          <w:szCs w:val="16"/>
+        </w:rPr>
+        <w:t xml:space="preserve">python -m </w:t>
+      </w:r>
+      <w:proofErr w:type="spellStart"/>
+      <w:r>
+        <w:rPr>
+          <w:rFonts w:ascii="Calibri" w:hAnsi="Calibri" w:cs="Calibri"/>
+          <w:b/>
+          <w:bCs/>
+          <w:sz w:val="16"/>
+          <w:szCs w:val="16"/>
+        </w:rPr>
+        <w:t>uvicorn</w:t>
+      </w:r>
+      <w:proofErr w:type="spellEnd"/>
+      <w:r>
+        <w:rPr>
+          <w:rFonts w:ascii="Calibri" w:hAnsi="Calibri" w:cs="Calibri"/>
+          <w:b/>
+          <w:bCs/>
+          <w:sz w:val="16"/>
+          <w:szCs w:val="16"/>
+        </w:rPr>
+        <w:t xml:space="preserve"> </w:t>
+      </w:r>
+      <w:proofErr w:type="spellStart"/>
+      <w:r>
+        <w:rPr>
+          <w:rFonts w:ascii="Calibri" w:hAnsi="Calibri" w:cs="Calibri"/>
+          <w:b/>
+          <w:bCs/>
+          <w:sz w:val="16"/>
+          <w:szCs w:val="16"/>
+        </w:rPr>
+        <w:t>mssqlconn:app</w:t>
+      </w:r>
+      <w:proofErr w:type="spellEnd"/>
+      <w:r>
+        <w:rPr>
+          <w:rFonts w:ascii="Calibri" w:hAnsi="Calibri" w:cs="Calibri"/>
+          <w:b/>
+          <w:bCs/>
+          <w:sz w:val="16"/>
+          <w:szCs w:val="16"/>
+        </w:rPr>
+        <w:t xml:space="preserve"> --reload</w:t>
+      </w:r>
+    </w:p>
+    <w:p>
+      <w:pPr>
+        <w:pStyle w:val="NormalWeb"/>
+        <w:numPr>
+          <w:ilvl w:val="1"/>
+          <w:numId w:val="19"/>
+        </w:numPr>
+        <w:spacing w:after="0"/>
+        <w:rPr>
+          <w:rFonts w:ascii="Calibri" w:hAnsi="Calibri" w:cs="Calibri"/>
+          <w:sz w:val="16"/>
+          <w:szCs w:val="16"/>
+        </w:rPr>
+      </w:pPr>
+      <w:r>
+        <w:rPr>
+          <w:rFonts w:ascii="Calibri" w:hAnsi="Calibri" w:cs="Calibri"/>
+          <w:sz w:val="16"/>
+          <w:szCs w:val="16"/>
+        </w:rPr>
+        <w:t xml:space="preserve">PS C:\Projects\VSCodeProjects\KPPythonApp\backend\mssqlpy&gt; </w:t>
+      </w:r>
+      <w:r>
+        <w:rPr>
+          <w:rFonts w:ascii="Calibri" w:hAnsi="Calibri" w:cs="Calibri"/>
+          <w:b/>
+          <w:bCs/>
+          <w:sz w:val="16"/>
+          <w:szCs w:val="16"/>
+        </w:rPr>
+        <w:t xml:space="preserve">python -m </w:t>
+      </w:r>
+      <w:proofErr w:type="spellStart"/>
+      <w:r>
+        <w:rPr>
+          <w:rFonts w:ascii="Calibri" w:hAnsi="Calibri" w:cs="Calibri"/>
+          <w:b/>
+          <w:bCs/>
+          <w:sz w:val="16"/>
+          <w:szCs w:val="16"/>
+        </w:rPr>
+        <w:t>uvicorn</w:t>
+      </w:r>
+      <w:proofErr w:type="spellEnd"/>
+      <w:r>
+        <w:rPr>
+          <w:rFonts w:ascii="Calibri" w:hAnsi="Calibri" w:cs="Calibri"/>
+          <w:b/>
+          <w:bCs/>
+          <w:sz w:val="16"/>
+          <w:szCs w:val="16"/>
+        </w:rPr>
+        <w:t xml:space="preserve"> </w:t>
+      </w:r>
+      <w:proofErr w:type="spellStart"/>
+      <w:r>
+        <w:rPr>
+          <w:rFonts w:ascii="Calibri" w:hAnsi="Calibri" w:cs="Calibri"/>
+          <w:b/>
+          <w:bCs/>
+          <w:sz w:val="16"/>
+          <w:szCs w:val="16"/>
+        </w:rPr>
+        <w:t>mssqlconn:app</w:t>
+      </w:r>
+      <w:proofErr w:type="spellEnd"/>
+      <w:r>
+        <w:rPr>
+          <w:rFonts w:ascii="Calibri" w:hAnsi="Calibri" w:cs="Calibri"/>
+          <w:b/>
+          <w:bCs/>
+          <w:sz w:val="16"/>
+          <w:szCs w:val="16"/>
+        </w:rPr>
+        <w:t xml:space="preserve"> --reload</w:t>
+      </w:r>
+    </w:p>
+    <w:p>
+      <w:pPr>
+        <w:pStyle w:val="NormalWeb"/>
+        <w:numPr>
+          <w:ilvl w:val="1"/>
+          <w:numId w:val="19"/>
+        </w:numPr>
+        <w:spacing w:after="0"/>
+        <w:rPr>
+          <w:rFonts w:ascii="Calibri" w:hAnsi="Calibri" w:cs="Calibri"/>
+          <w:sz w:val="16"/>
+          <w:szCs w:val="16"/>
+        </w:rPr>
+      </w:pPr>
+      <w:r>
+        <w:rPr>
+          <w:rFonts w:ascii="Calibri" w:hAnsi="Calibri" w:cs="Calibri"/>
+          <w:sz w:val="16"/>
+          <w:szCs w:val="16"/>
+        </w:rPr>
+        <w:t>INFO:     Will watch for changes in these directories: ['C:\\Projects\\</w:t>
+      </w:r>
+      <w:proofErr w:type="spellStart"/>
+      <w:r>
+        <w:rPr>
+          <w:rFonts w:ascii="Calibri" w:hAnsi="Calibri" w:cs="Calibri"/>
+          <w:sz w:val="16"/>
+          <w:szCs w:val="16"/>
+        </w:rPr>
+        <w:t>VSCodeProjects</w:t>
+      </w:r>
+      <w:proofErr w:type="spellEnd"/>
+      <w:r>
+        <w:rPr>
+          <w:rFonts w:ascii="Calibri" w:hAnsi="Calibri" w:cs="Calibri"/>
+          <w:sz w:val="16"/>
+          <w:szCs w:val="16"/>
+        </w:rPr>
+        <w:t>\\</w:t>
+      </w:r>
+      <w:proofErr w:type="spellStart"/>
+      <w:r>
+        <w:rPr>
+          <w:rFonts w:ascii="Calibri" w:hAnsi="Calibri" w:cs="Calibri"/>
+          <w:sz w:val="16"/>
+          <w:szCs w:val="16"/>
+        </w:rPr>
+        <w:t>KPPythonApp</w:t>
+      </w:r>
+      <w:proofErr w:type="spellEnd"/>
+      <w:r>
+        <w:rPr>
+          <w:rFonts w:ascii="Calibri" w:hAnsi="Calibri" w:cs="Calibri"/>
+          <w:sz w:val="16"/>
+          <w:szCs w:val="16"/>
+        </w:rPr>
+        <w:t>\\backend\\</w:t>
+      </w:r>
+      <w:proofErr w:type="spellStart"/>
+      <w:r>
+        <w:rPr>
+          <w:rFonts w:ascii="Calibri" w:hAnsi="Calibri" w:cs="Calibri"/>
+          <w:sz w:val="16"/>
+          <w:szCs w:val="16"/>
+        </w:rPr>
+        <w:t>mssqlpy</w:t>
+      </w:r>
+      <w:proofErr w:type="spellEnd"/>
+      <w:r>
+        <w:rPr>
+          <w:rFonts w:ascii="Calibri" w:hAnsi="Calibri" w:cs="Calibri"/>
+          <w:sz w:val="16"/>
+          <w:szCs w:val="16"/>
+        </w:rPr>
+        <w:t>']</w:t>
+      </w:r>
+    </w:p>
+    <w:p>
+      <w:pPr>
+        <w:pStyle w:val="NormalWeb"/>
+        <w:numPr>
+          <w:ilvl w:val="1"/>
+          <w:numId w:val="19"/>
+        </w:numPr>
+        <w:spacing w:after="0"/>
+        <w:rPr>
+          <w:rFonts w:ascii="Calibri" w:hAnsi="Calibri" w:cs="Calibri"/>
+          <w:sz w:val="16"/>
+          <w:szCs w:val="16"/>
+        </w:rPr>
+      </w:pPr>
+      <w:r>
+        <w:rPr>
+          <w:rFonts w:ascii="Calibri" w:hAnsi="Calibri" w:cs="Calibri"/>
+          <w:sz w:val="16"/>
+          <w:szCs w:val="16"/>
+        </w:rPr>
+        <w:t xml:space="preserve">INFO:    </w:t>
+      </w:r>
+      <w:r>
+        <w:rPr>
+          <w:rFonts w:ascii="Calibri" w:hAnsi="Calibri" w:cs="Calibri"/>
+          <w:b/>
+          <w:bCs/>
+          <w:color w:val="538135" w:themeColor="accent6" w:themeShade="BF"/>
+          <w:sz w:val="16"/>
+          <w:szCs w:val="16"/>
+        </w:rPr>
+        <w:t xml:space="preserve"> Uvicorn running on http://127.0.0.1:8000</w:t>
+      </w:r>
+      <w:r>
+        <w:rPr>
+          <w:rFonts w:ascii="Calibri" w:hAnsi="Calibri" w:cs="Calibri"/>
+          <w:sz w:val="16"/>
+          <w:szCs w:val="16"/>
+        </w:rPr>
+        <w:t xml:space="preserve"> (Press CTRL+C to quit)</w:t>
+      </w:r>
+    </w:p>
+    <w:p>
+      <w:pPr>
+        <w:pStyle w:val="NormalWeb"/>
+        <w:numPr>
+          <w:ilvl w:val="0"/>
+          <w:numId w:val="19"/>
+        </w:numPr>
+        <w:spacing w:before="0" w:beforeAutospacing="0" w:after="0" w:afterAutospacing="0"/>
+        <w:rPr>
+          <w:rFonts w:ascii="Calibri" w:hAnsi="Calibri" w:cs="Calibri"/>
+          <w:sz w:val="22"/>
+          <w:szCs w:val="22"/>
+        </w:rPr>
+      </w:pPr>
+      <w:r>
+        <w:rPr>
+          <w:rFonts w:ascii="Calibri" w:hAnsi="Calibri" w:cs="Calibri"/>
+          <w:sz w:val="22"/>
+          <w:szCs w:val="22"/>
+        </w:rPr>
+        <w:drawing>
+          <wp:inline distT="0" distB="0" distL="0" distR="0" wp14:anchorId="17BDB194" wp14:editId="29D00A87">
+            <wp:extent cx="5943600" cy="3202940"/>
+            <wp:effectExtent l="0" t="0" r="0" b="0"/>
+            <wp:docPr id="1513325972" name="Picture 1"/>
+            <wp:cNvGraphicFramePr>
+              <a:graphicFrameLocks xmlns:a="http://schemas.openxmlformats.org/drawingml/2006/main" noChangeAspect="1"/>
+            </wp:cNvGraphicFramePr>
+            <a:graphic xmlns:a="http://schemas.openxmlformats.org/drawingml/2006/main">
+              <a:graphicData uri="http://schemas.openxmlformats.org/drawingml/2006/picture">
+                <pic:pic xmlns:pic="http://schemas.openxmlformats.org/drawingml/2006/picture">
+                  <pic:nvPicPr>
+                    <pic:cNvPr id="1513325972" name=""/>
+                    <pic:cNvPicPr/>
+                  </pic:nvPicPr>
+                  <pic:blipFill>
+                    <a:blip r:embed="rId20"/>
+                    <a:stretch>
+                      <a:fillRect/>
+                    </a:stretch>
+                  </pic:blipFill>
+                  <pic:spPr>
+                    <a:xfrm>
+                      <a:off x="0" y="0"/>
+                      <a:ext cx="5943600" cy="3202940"/>
+                    </a:xfrm>
+                    <a:prstGeom prst="rect">
+                      <a:avLst/>
+                    </a:prstGeom>
+                  </pic:spPr>
+                </pic:pic>
+              </a:graphicData>
+            </a:graphic>
+          </wp:inline>
+        </w:drawing>
+      </w:r>
+    </w:p>
+    <w:p>
+      <w:pPr>
+        <w:pStyle w:val="NormalWeb"/>
+        <w:numPr>
+          <w:ilvl w:val="0"/>
+          <w:numId w:val="19"/>
+        </w:numPr>
+        <w:spacing w:before="0" w:beforeAutospacing="0" w:after="0" w:afterAutospacing="0"/>
+        <w:rPr>
+          <w:rFonts w:ascii="Calibri" w:hAnsi="Calibri" w:cs="Calibri"/>
+          <w:sz w:val="22"/>
+          <w:szCs w:val="22"/>
+        </w:rPr>
+      </w:pPr>
+      <w:r>
+        <w:rPr>
+          <w:rFonts w:ascii="Calibri" w:hAnsi="Calibri" w:cs="Calibri"/>
+          <w:sz w:val="22"/>
+          <w:szCs w:val="22"/>
+        </w:rPr>
+        <w:t xml:space="preserve">API Call on </w:t>
+      </w:r>
+      <w:proofErr w:type="gramStart"/>
+      <w:r>
+        <w:rPr>
+          <w:rFonts w:ascii="Calibri" w:hAnsi="Calibri" w:cs="Calibri"/>
+          <w:sz w:val="22"/>
+          <w:szCs w:val="22"/>
+        </w:rPr>
+        <w:t>Postman :</w:t>
+      </w:r>
+      <w:proofErr w:type="gramEnd"/>
+      <w:r>
+        <w:rPr>
+          <w:rFonts w:ascii="Calibri" w:hAnsi="Calibri" w:cs="Calibri"/>
+          <w:sz w:val="22"/>
+          <w:szCs w:val="22"/>
+        </w:rPr>
+        <w:t xml:space="preserve"> </w:t>
+      </w:r>
+      <w:r>
+        <w:rPr>
+          <w:rFonts w:ascii="Calibri" w:hAnsi="Calibri" w:cs="Calibri"/>
+          <w:sz w:val="22"/>
+          <w:szCs w:val="22"/>
+        </w:rPr>
+        <w:t>http://localhost:8000/all</w:t>
+      </w:r>
+    </w:p>
+    <w:p>
+      <w:pPr>
+        <w:pStyle w:val="NormalWeb"/>
+        <w:numPr>
+          <w:ilvl w:val="0"/>
+          <w:numId w:val="19"/>
+        </w:numPr>
+        <w:spacing w:before="0" w:beforeAutospacing="0" w:after="0" w:afterAutospacing="0"/>
+        <w:rPr>
+          <w:rFonts w:ascii="Calibri" w:hAnsi="Calibri" w:cs="Calibri"/>
+          <w:sz w:val="22"/>
+          <w:szCs w:val="22"/>
+        </w:rPr>
+      </w:pPr>
+      <w:r>
+        <w:rPr>
+          <w:rFonts w:ascii="Calibri" w:hAnsi="Calibri" w:cs="Calibri"/>
+          <w:sz w:val="22"/>
+          <w:szCs w:val="22"/>
+        </w:rPr>
+        <w:lastRenderedPageBreak/>
+        <w:drawing>
+          <wp:inline distT="0" distB="0" distL="0" distR="0" wp14:anchorId="4DCDF8C8" wp14:editId="46603F48">
+            <wp:extent cx="5943600" cy="6437630"/>
+            <wp:effectExtent l="0" t="0" r="0" b="1270"/>
+            <wp:docPr id="374796094" name="Picture 1"/>
+            <wp:cNvGraphicFramePr>
+              <a:graphicFrameLocks xmlns:a="http://schemas.openxmlformats.org/drawingml/2006/main" noChangeAspect="1"/>
+            </wp:cNvGraphicFramePr>
+            <a:graphic xmlns:a="http://schemas.openxmlformats.org/drawingml/2006/main">
+              <a:graphicData uri="http://schemas.openxmlformats.org/drawingml/2006/picture">
+                <pic:pic xmlns:pic="http://schemas.openxmlformats.org/drawingml/2006/picture">
+                  <pic:nvPicPr>
+                    <pic:cNvPr id="374796094" name=""/>
+                    <pic:cNvPicPr/>
+                  </pic:nvPicPr>
+                  <pic:blipFill>
+                    <a:blip r:embed="rId21"/>
+                    <a:stretch>
+                      <a:fillRect/>
+                    </a:stretch>
+                  </pic:blipFill>
+                  <pic:spPr>
+                    <a:xfrm>
+                      <a:off x="0" y="0"/>
+                      <a:ext cx="5943600" cy="6437630"/>
+                    </a:xfrm>
+                    <a:prstGeom prst="rect">
+                      <a:avLst/>
+                    </a:prstGeom>
+                  </pic:spPr>
+                </pic:pic>
+              </a:graphicData>
+            </a:graphic>
+          </wp:inline>
+        </w:drawing>
+      </w:r>
+    </w:p>
+    <w:p>
+      <w:pPr>
+        <w:pStyle w:val="NormalWeb"/>
+        <w:spacing w:before="0" w:beforeAutospacing="0" w:after="0" w:afterAutospacing="0"/>
+        <w:rPr>
+          <w:rFonts w:ascii="Calibri" w:hAnsi="Calibri" w:cs="Calibri"/>
+          <w:sz w:val="22"/>
+          <w:szCs w:val="22"/>
+        </w:rPr>
+      </w:pPr>
+    </w:p>
+    <w:p>
+      <w:pPr>
+        <w:pStyle w:val="NormalWeb"/>
+        <w:spacing w:before="0" w:beforeAutospacing="0" w:after="0" w:afterAutospacing="0"/>
+        <w:rPr>
+          <w:rFonts w:ascii="Calibri" w:hAnsi="Calibri" w:cs="Calibri"/>
+          <w:sz w:val="22"/>
+          <w:szCs w:val="22"/>
+        </w:rPr>
+      </w:pPr>
+    </w:p>
+    <w:p>
+      <w:pPr>
+        <w:pStyle w:val="NormalWeb"/>
+        <w:spacing w:before="0" w:beforeAutospacing="0" w:after="0" w:afterAutospacing="0"/>
+        <w:rPr>
+          <w:rFonts w:ascii="Calibri" w:hAnsi="Calibri" w:cs="Calibri"/>
+          <w:sz w:val="22"/>
+          <w:szCs w:val="22"/>
+        </w:rPr>
+      </w:pPr>
+    </w:p>
+    <w:p>
+      <w:pPr>
         <w:pStyle w:val="NormalWeb"/>
         <w:spacing w:before="0" w:beforeAutospacing="0" w:after="0" w:afterAutospacing="0"/>
         <w:rPr>
@@ -2498,7 +3802,7 @@
                     </pic:cNvPicPr>
                   </pic:nvPicPr>
                   <pic:blipFill>
-                    <a:blip r:embed="rId18">
+                    <a:blip r:embed="rId22">
                       <a:extLst>
                         <a:ext uri="{28A0092B-C50C-407E-A947-70E740481C1C}">
                           <a14:useLocalDpi xmlns:a14="http://schemas.microsoft.com/office/drawing/2010/main" val="0"/>
@@ -2603,7 +3907,7 @@
                     </pic:cNvPicPr>
                   </pic:nvPicPr>
                   <pic:blipFill>
-                    <a:blip r:embed="rId19">
+                    <a:blip r:embed="rId23">
                       <a:extLst>
                         <a:ext uri="{28A0092B-C50C-407E-A947-70E740481C1C}">
                           <a14:useLocalDpi xmlns:a14="http://schemas.microsoft.com/office/drawing/2010/main" val="0"/>
@@ -2669,7 +3973,7 @@
           <w:rFonts w:ascii="Calibri" w:hAnsi="Calibri" w:cs="Calibri"/>
         </w:rPr>
       </w:pPr>
-      <w:hyperlink r:id="rId20" w:history="1">
+      <w:hyperlink r:id="rId24" w:history="1">
         <w:r>
           <w:rPr>
             <w:rStyle w:val="Hyperlink"/>
@@ -2717,7 +4021,7 @@
           <w:rFonts w:ascii="Calibri" w:hAnsi="Calibri" w:cs="Calibri"/>
         </w:rPr>
       </w:pPr>
-      <w:hyperlink r:id="rId21" w:history="1">
+      <w:hyperlink r:id="rId25" w:history="1">
         <w:r>
           <w:rPr>
             <w:rStyle w:val="Hyperlink"/>
@@ -2739,7 +4043,7 @@
           <w:rFonts w:ascii="Calibri" w:hAnsi="Calibri" w:cs="Calibri"/>
         </w:rPr>
       </w:pPr>
-      <w:hyperlink r:id="rId22" w:history="1">
+      <w:hyperlink r:id="rId26" w:history="1">
         <w:r>
           <w:rPr>
             <w:rStyle w:val="Hyperlink"/>
@@ -2751,14 +4055,284 @@
     </w:p>
     <w:p>
       <w:pPr>
-        <w:pStyle w:val="NormalWeb"/>
-        <w:spacing w:before="0" w:beforeAutospacing="0" w:after="0" w:afterAutospacing="0"/>
-        <w:rPr>
-          <w:rFonts w:ascii="Calibri" w:hAnsi="Calibri" w:cs="Calibri"/>
-        </w:rPr>
-      </w:pPr>
-      <w:bookmarkStart w:id="0" w:name="_GoBack"/>
-      <w:bookmarkEnd w:id="0"/>
+        <w:numPr>
+          <w:ilvl w:val="0"/>
+          <w:numId w:val="22"/>
+        </w:numPr>
+        <w:spacing w:after="0" w:line="240" w:lineRule="auto"/>
+        <w:ind w:left="540"/>
+        <w:textAlignment w:val="center"/>
+        <w:rPr>
+          <w:rFonts w:ascii="Calibri" w:hAnsi="Calibri" w:cs="Calibri"/>
+        </w:rPr>
+      </w:pPr>
+      <w:r>
+        <w:rPr>
+          <w:rFonts w:ascii="Calibri" w:hAnsi="Calibri" w:cs="Calibri"/>
+        </w:rPr>
+        <w:t>C</w:t>
+      </w:r>
+      <w:r>
+        <w:rPr>
+          <w:rFonts w:ascii="Calibri" w:hAnsi="Calibri" w:cs="Calibri"/>
+        </w:rPr>
+        <w:t xml:space="preserve">onvert </w:t>
+      </w:r>
+      <w:proofErr w:type="spellStart"/>
+      <w:r>
+        <w:rPr>
+          <w:rFonts w:ascii="Calibri" w:hAnsi="Calibri" w:cs="Calibri"/>
+        </w:rPr>
+        <w:t>json</w:t>
+      </w:r>
+      <w:proofErr w:type="spellEnd"/>
+      <w:r>
+        <w:rPr>
+          <w:rFonts w:ascii="Calibri" w:hAnsi="Calibri" w:cs="Calibri"/>
+        </w:rPr>
+        <w:t xml:space="preserve"> string to </w:t>
+      </w:r>
+      <w:proofErr w:type="spellStart"/>
+      <w:r>
+        <w:rPr>
+          <w:rFonts w:ascii="Calibri" w:hAnsi="Calibri" w:cs="Calibri"/>
+        </w:rPr>
+        <w:t>json</w:t>
+      </w:r>
+      <w:proofErr w:type="spellEnd"/>
+      <w:r>
+        <w:rPr>
+          <w:rFonts w:ascii="Calibri" w:hAnsi="Calibri" w:cs="Calibri"/>
+        </w:rPr>
+        <w:t xml:space="preserve"> object in python</w:t>
+      </w:r>
+    </w:p>
+    <w:p>
+      <w:pPr>
+        <w:spacing w:after="0" w:line="240" w:lineRule="auto"/>
+        <w:ind w:left="540"/>
+        <w:textAlignment w:val="center"/>
+        <w:rPr>
+          <w:rFonts w:ascii="Calibri" w:hAnsi="Calibri" w:cs="Calibri"/>
+        </w:rPr>
+      </w:pPr>
+      <w:hyperlink r:id="rId27" w:history="1">
+        <w:r>
+          <w:rPr>
+            <w:rStyle w:val="Hyperlink"/>
+            <w:rFonts w:ascii="Calibri" w:hAnsi="Calibri" w:cs="Calibri"/>
+          </w:rPr>
+          <w:t>https://www.google.com/search?q=how+to+convert+json+string+to+json+object+in+python&amp;rlz=1C1WHAR_enUS1168US1168&amp;oq=How+to+convert+Json+string+to+json+object+in+&amp;gs_lcrp=EgZjaHJvbWUqBwgDEAAYgAQyBwgAEAAYgAQyBwgBEAAYgAQyBggCEEUYOTIHCAMQABiABDIHCAQQABiABDIICAUQABgWGB4yCAgGEAAYFhgeMggIBxAAGBYYHjIICAgQABgWGB4yCAgJEAAYFhge0gEKMTc5NjJqMGoxNagCCLACAfEFhgR2sHNNErzxBYYEdrBzTRK8&amp;sourceid=chrome&amp;ie=UTF-8#cobssid=s</w:t>
+        </w:r>
+      </w:hyperlink>
+    </w:p>
+    <w:p>
+      <w:pPr>
+        <w:spacing w:after="0" w:line="240" w:lineRule="auto"/>
+        <w:textAlignment w:val="center"/>
+        <w:rPr>
+          <w:rFonts w:ascii="Calibri" w:hAnsi="Calibri" w:cs="Calibri"/>
+        </w:rPr>
+      </w:pPr>
+    </w:p>
+    <w:p>
+      <w:pPr>
+        <w:numPr>
+          <w:ilvl w:val="0"/>
+          <w:numId w:val="22"/>
+        </w:numPr>
+        <w:spacing w:after="0" w:line="240" w:lineRule="auto"/>
+        <w:ind w:left="540"/>
+        <w:textAlignment w:val="center"/>
+        <w:rPr>
+          <w:rFonts w:ascii="Calibri" w:hAnsi="Calibri" w:cs="Calibri"/>
+        </w:rPr>
+      </w:pPr>
+      <w:r>
+        <w:rPr>
+          <w:rFonts w:ascii="Calibri" w:hAnsi="Calibri" w:cs="Calibri"/>
+        </w:rPr>
+        <w:t>C</w:t>
+      </w:r>
+      <w:r>
+        <w:rPr>
+          <w:rFonts w:ascii="Calibri" w:hAnsi="Calibri" w:cs="Calibri"/>
+        </w:rPr>
+        <w:t xml:space="preserve">onvert </w:t>
+      </w:r>
+      <w:proofErr w:type="spellStart"/>
+      <w:r>
+        <w:rPr>
+          <w:rFonts w:ascii="Calibri" w:hAnsi="Calibri" w:cs="Calibri"/>
+        </w:rPr>
+        <w:t>datetime.datetime</w:t>
+      </w:r>
+      <w:proofErr w:type="spellEnd"/>
+      <w:r>
+        <w:rPr>
+          <w:rFonts w:ascii="Calibri" w:hAnsi="Calibri" w:cs="Calibri"/>
+        </w:rPr>
+        <w:t xml:space="preserve">(2007, 12, 30, 0, 0) in a </w:t>
+      </w:r>
+      <w:proofErr w:type="spellStart"/>
+      <w:r>
+        <w:rPr>
+          <w:rFonts w:ascii="Calibri" w:hAnsi="Calibri" w:cs="Calibri"/>
+        </w:rPr>
+        <w:t>rowset</w:t>
+      </w:r>
+      <w:proofErr w:type="spellEnd"/>
+      <w:r>
+        <w:rPr>
+          <w:rFonts w:ascii="Calibri" w:hAnsi="Calibri" w:cs="Calibri"/>
+        </w:rPr>
+        <w:t xml:space="preserve"> into </w:t>
+      </w:r>
+      <w:proofErr w:type="spellStart"/>
+      <w:r>
+        <w:rPr>
+          <w:rFonts w:ascii="Calibri" w:hAnsi="Calibri" w:cs="Calibri"/>
+        </w:rPr>
+        <w:t>json</w:t>
+      </w:r>
+      <w:proofErr w:type="spellEnd"/>
+      <w:r>
+        <w:rPr>
+          <w:rFonts w:ascii="Calibri" w:hAnsi="Calibri" w:cs="Calibri"/>
+        </w:rPr>
+        <w:t xml:space="preserve"> object in python</w:t>
+      </w:r>
+      <w:r>
+        <w:rPr>
+          <w:rFonts w:ascii="Calibri" w:hAnsi="Calibri" w:cs="Calibri"/>
+        </w:rPr>
+        <w:t xml:space="preserve"> </w:t>
+      </w:r>
+      <w:hyperlink r:id="rId28" w:history="1">
+        <w:r>
+          <w:rPr>
+            <w:rStyle w:val="Hyperlink"/>
+            <w:rFonts w:ascii="Calibri" w:hAnsi="Calibri" w:cs="Calibri"/>
+          </w:rPr>
+          <w:t>https://www.google.com/search?q=How+to+convert+datetime.datetime(2007%2C+12%2C+30%2C+0%2C+0)+in+a+rowset+into+json+object+in+python&amp;rlz=1C1WHAR_enUS1168US1168&amp;oq=How+to+convert+datetime.datetime(2007%2C+12%2C+30%2C+0%2C+0)+in+a+rowset+into+json+object+in+python&amp;gs_lcrp=EgZjaHJvbWUyBggAEEUYOdIBCjM4MDkyajBqMTWoAgiwAgHxBYOObHA1f1ak8QWDjmxwNX9WpA&amp;sourceid=chrome&amp;ie=UTF-8</w:t>
+        </w:r>
+      </w:hyperlink>
+    </w:p>
+    <w:p>
+      <w:pPr>
+        <w:pStyle w:val="ListParagraph"/>
+        <w:rPr>
+          <w:rFonts w:ascii="Calibri" w:hAnsi="Calibri" w:cs="Calibri"/>
+        </w:rPr>
+      </w:pPr>
+    </w:p>
+    <w:p>
+      <w:pPr>
+        <w:numPr>
+          <w:ilvl w:val="0"/>
+          <w:numId w:val="22"/>
+        </w:numPr>
+        <w:spacing w:after="0" w:line="240" w:lineRule="auto"/>
+        <w:ind w:left="540"/>
+        <w:textAlignment w:val="center"/>
+        <w:rPr>
+          <w:rFonts w:ascii="Calibri" w:hAnsi="Calibri" w:cs="Calibri"/>
+        </w:rPr>
+      </w:pPr>
+      <w:r>
+        <w:rPr>
+          <w:rFonts w:ascii="Calibri" w:hAnsi="Calibri" w:cs="Calibri"/>
+        </w:rPr>
+        <w:t xml:space="preserve">Run </w:t>
+      </w:r>
+      <w:r>
+        <w:rPr>
+          <w:rFonts w:ascii="Calibri" w:hAnsi="Calibri" w:cs="Calibri"/>
+        </w:rPr>
+        <w:t>Uvicorn as a Python Module </w:t>
+      </w:r>
+    </w:p>
+    <w:p>
+      <w:pPr>
+        <w:ind w:left="540"/>
+        <w:rPr>
+          <w:rFonts w:ascii="Calibri" w:hAnsi="Calibri" w:cs="Calibri"/>
+        </w:rPr>
+      </w:pPr>
+      <w:hyperlink r:id="rId29" w:history="1">
+        <w:r>
+          <w:rPr>
+            <w:rStyle w:val="Hyperlink"/>
+            <w:rFonts w:ascii="Calibri" w:hAnsi="Calibri" w:cs="Calibri"/>
+          </w:rPr>
+          <w:t>https://www.google.com/search?q=uvicorn+%3A+The+term+%27uvicorn%27+is+not+recognized+as+the+name+of+a+cmdlet%2C+function%2C+script+file%2C+or+operable+program.+Check+the+spelling+of+the+name%2C+or+if+a+path+was+included%2C+verify+that+the+path+is+correct+and+try+again.+At+line%3A1+char%3A1+%2B+uvicorn+mssqlconn%3Aapp+--reload+%2B+~~~~~~~+%2B+CategoryInfo+%3A+ObjectNotFound%3A+(uvicorn%3AString)+%5B%5D%2C+CommandNotFoundException+%2B+FullyQualifiedErrorId+%3A+CommandNotFoundExcept</w:t>
+        </w:r>
+        <w:r>
+          <w:rPr>
+            <w:rStyle w:val="Hyperlink"/>
+            <w:rFonts w:ascii="Calibri" w:hAnsi="Calibri" w:cs="Calibri"/>
+          </w:rPr>
+          <w:lastRenderedPageBreak/>
+          <w:t>ion&amp;rlz=1C1WHAR_enUS1168US1168&amp;oq=uvicorn+%3A+The+term+%27uvicorn%27+is+not+recognized+as+the+name+of+a+cmdlet%2C+function%2C+script+file%2C+or++operable+program.+Check+the+spelling+of+the+name%2C+or+if+a+path+was+included%2C+verify+that+the+path+is++++correct+and+try+again.+At+line%3A1+char%3A1+%2B+uvicorn+mssqlconn%3Aapp+--reload+%2B+~~~~~~~+++++%2B+CategoryInfo++++++++++%3A+ObjectNotFound%3A+(uvicorn%3AString)+%5B%5D%2C+CommandNotFoundException+++++%2B+FullyQualifiedErrorId+%3A+CommandNotFoundException&amp;gs_lcrp=EgZjaHJvbWUyBggAEEUYOTIHCAEQIRiPAtIBCTE4MzdqMGoxNagCCLACAfEFUs-op7wBfiTxBVLPqKe8AX4k&amp;sourceid=chrome&amp;ie=UTF-8</w:t>
+        </w:r>
+      </w:hyperlink>
+    </w:p>
+    <w:p>
+      <w:pPr>
+        <w:ind w:left="540"/>
+        <w:rPr>
+          <w:rFonts w:ascii="Calibri" w:hAnsi="Calibri" w:cs="Calibri"/>
+        </w:rPr>
+      </w:pPr>
+    </w:p>
+    <w:p>
+      <w:pPr>
+        <w:numPr>
+          <w:ilvl w:val="0"/>
+          <w:numId w:val="22"/>
+        </w:numPr>
+        <w:spacing w:after="0" w:line="240" w:lineRule="auto"/>
+        <w:ind w:left="540"/>
+        <w:textAlignment w:val="center"/>
+        <w:rPr>
+          <w:rFonts w:ascii="Calibri" w:hAnsi="Calibri" w:cs="Calibri"/>
+        </w:rPr>
+      </w:pPr>
+      <w:r>
+        <w:rPr>
+          <w:rFonts w:ascii="Calibri" w:hAnsi="Calibri" w:cs="Calibri"/>
+        </w:rPr>
+        <w:t>Run Uvicorn as a Python Module </w:t>
+      </w:r>
+    </w:p>
+    <w:p>
+      <w:pPr>
+        <w:spacing w:after="0" w:line="240" w:lineRule="auto"/>
+        <w:ind w:left="540"/>
+        <w:textAlignment w:val="center"/>
+        <w:rPr>
+          <w:rFonts w:ascii="Calibri" w:hAnsi="Calibri" w:cs="Calibri"/>
+        </w:rPr>
+      </w:pPr>
+      <w:hyperlink r:id="rId30" w:history="1">
+        <w:r>
+          <w:rPr>
+            <w:rStyle w:val="Hyperlink"/>
+            <w:rFonts w:ascii="Calibri" w:hAnsi="Calibri" w:cs="Calibri"/>
+          </w:rPr>
+          <w:t>https://learn.microsoft.com/en-us/azure/azure-sql/database/azure-sql-python-quickstart?view=azuresql&amp;tabs=windows%2Csql-inter</w:t>
+        </w:r>
+      </w:hyperlink>
+    </w:p>
+    <w:p>
+      <w:pPr>
+        <w:spacing w:after="0" w:line="240" w:lineRule="auto"/>
+        <w:ind w:left="180"/>
+        <w:textAlignment w:val="center"/>
+        <w:rPr>
+          <w:rFonts w:ascii="Calibri" w:hAnsi="Calibri" w:cs="Calibri"/>
+        </w:rPr>
+      </w:pPr>
     </w:p>
     <w:sectPr>
       <w:pgSz w:w="12240" w:h="15840"/>
@@ -2771,7 +4345,7 @@
 </file>
 
 <file path=word/numbering.xml><?xml version="1.0" encoding="utf-8"?>
-<w:numbering xmlns:wpc="http://schemas.microsoft.com/office/word/2010/wordprocessingCanvas" xmlns:cx="http://schemas.microsoft.com/office/drawing/2014/chartex" xmlns:cx1="http://schemas.microsoft.com/office/drawing/2015/9/8/chartex" xmlns:cx2="http://schemas.microsoft.com/office/drawing/2015/10/21/chartex" xmlns:cx3="http://schemas.microsoft.com/office/drawing/2016/5/9/chartex" xmlns:cx4="http://schemas.microsoft.com/office/drawing/2016/5/10/chartex" xmlns:cx5="http://schemas.microsoft.com/office/drawing/2016/5/11/chartex" xmlns:cx6="http://schemas.microsoft.com/office/drawing/2016/5/12/chartex" xmlns:cx7="http://schemas.microsoft.com/office/drawing/2016/5/13/chartex" xmlns:cx8="http://schemas.microsoft.com/office/drawing/2016/5/14/chartex" xmlns:mc="http://schemas.openxmlformats.org/markup-compatibility/2006" xmlns:aink="http://schemas.microsoft.com/office/drawing/2016/ink" xmlns:am3d="http://schemas.microsoft.com/office/drawing/2017/model3d" xmlns:o="urn:schemas-microsoft-com:office:office" xmlns:r="http://schemas.openxmlformats.org/officeDocument/2006/relationships" xmlns:m="http://schemas.openxmlformats.org/officeDocument/2006/math" xmlns:v="urn:schemas-microsoft-com:vml" xmlns:wp14="http://schemas.microsoft.com/office/word/2010/wordprocessingDrawing" xmlns:wp="http://schemas.openxmlformats.org/drawingml/2006/wordprocessingDrawing" xmlns:w10="urn:schemas-microsoft-com:office:word" xmlns:w="http://schemas.openxmlformats.org/wordprocessingml/2006/main" xmlns:w14="http://schemas.microsoft.com/office/word/2010/wordml" xmlns:w15="http://schemas.microsoft.com/office/word/2012/wordml" xmlns:w16cid="http://schemas.microsoft.com/office/word/2016/wordml/cid" xmlns:w16se="http://schemas.microsoft.com/office/word/2015/wordml/symex" xmlns:wpg="http://schemas.microsoft.com/office/word/2010/wordprocessingGroup" xmlns:wpi="http://schemas.microsoft.com/office/word/2010/wordprocessingInk" xmlns:wne="http://schemas.microsoft.com/office/word/2006/wordml" xmlns:wps="http://schemas.microsoft.com/office/word/2010/wordprocessingShape" mc:Ignorable="w14 w15 w16se w16cid wp14">
+<w:numbering xmlns:wpc="http://schemas.microsoft.com/office/word/2010/wordprocessingCanvas" xmlns:cx="http://schemas.microsoft.com/office/drawing/2014/chartex" xmlns:cx1="http://schemas.microsoft.com/office/drawing/2015/9/8/chartex" xmlns:cx2="http://schemas.microsoft.com/office/drawing/2015/10/21/chartex" xmlns:cx3="http://schemas.microsoft.com/office/drawing/2016/5/9/chartex" xmlns:cx4="http://schemas.microsoft.com/office/drawing/2016/5/10/chartex" xmlns:cx5="http://schemas.microsoft.com/office/drawing/2016/5/11/chartex" xmlns:cx6="http://schemas.microsoft.com/office/drawing/2016/5/12/chartex" xmlns:cx7="http://schemas.microsoft.com/office/drawing/2016/5/13/chartex" xmlns:cx8="http://schemas.microsoft.com/office/drawing/2016/5/14/chartex" xmlns:mc="http://schemas.openxmlformats.org/markup-compatibility/2006" xmlns:aink="http://schemas.microsoft.com/office/drawing/2016/ink" xmlns:am3d="http://schemas.microsoft.com/office/drawing/2017/model3d" xmlns:o="urn:schemas-microsoft-com:office:office" xmlns:oel="http://schemas.microsoft.com/office/2019/extlst" xmlns:r="http://schemas.openxmlformats.org/officeDocument/2006/relationships" xmlns:m="http://schemas.openxmlformats.org/officeDocument/2006/math" xmlns:v="urn:schemas-microsoft-com:vml" xmlns:wp14="http://schemas.microsoft.com/office/word/2010/wordprocessingDrawing" xmlns:wp="http://schemas.openxmlformats.org/drawingml/2006/wordprocessingDrawing" xmlns:w10="urn:schemas-microsoft-com:office:word" xmlns:w="http://schemas.openxmlformats.org/wordprocessingml/2006/main" xmlns:w14="http://schemas.microsoft.com/office/word/2010/wordml" xmlns:w15="http://schemas.microsoft.com/office/word/2012/wordml" xmlns:w16cex="http://schemas.microsoft.com/office/word/2018/wordml/cex" xmlns:w16cid="http://schemas.microsoft.com/office/word/2016/wordml/cid" xmlns:w16="http://schemas.microsoft.com/office/word/2018/wordml" xmlns:w16du="http://schemas.microsoft.com/office/word/2023/wordml/word16du" xmlns:w16sdtdh="http://schemas.microsoft.com/office/word/2020/wordml/sdtdatahash" xmlns:w16sdtfl="http://schemas.microsoft.com/office/word/2024/wordml/sdtformatlock" xmlns:w16se="http://schemas.microsoft.com/office/word/2015/wordml/symex" xmlns:wpg="http://schemas.microsoft.com/office/word/2010/wordprocessingGroup" xmlns:wpi="http://schemas.microsoft.com/office/word/2010/wordprocessingInk" xmlns:wne="http://schemas.microsoft.com/office/word/2006/wordml" xmlns:wps="http://schemas.microsoft.com/office/word/2010/wordprocessingShape" mc:Ignorable="w14 w15 w16se w16cid w16 w16cex w16sdtdh w16sdtfl w16du wp14">
   <w:abstractNum w:abstractNumId="0" w15:restartNumberingAfterBreak="0">
     <w:nsid w:val="05CE6CC8"/>
     <w:multiLevelType w:val="multilevel"/>
@@ -3537,7 +5111,7 @@
         <w:sz w:val="20"/>
       </w:rPr>
     </w:lvl>
-    <w:lvl w:ilvl="1" w:tentative="1">
+    <w:lvl w:ilvl="1">
       <w:start w:val="1"/>
       <w:numFmt w:val="bullet"/>
       <w:lvlText w:val=""/>
@@ -3553,7 +5127,7 @@
         <w:sz w:val="20"/>
       </w:rPr>
     </w:lvl>
-    <w:lvl w:ilvl="2" w:tentative="1">
+    <w:lvl w:ilvl="2">
       <w:start w:val="1"/>
       <w:numFmt w:val="bullet"/>
       <w:lvlText w:val=""/>
@@ -5717,6 +7291,119 @@
     </w:lvl>
   </w:abstractNum>
   <w:abstractNum w:abstractNumId="20" w15:restartNumberingAfterBreak="0">
+    <w:nsid w:val="6AA87AD9"/>
+    <w:multiLevelType w:val="hybridMultilevel"/>
+    <w:tmpl w:val="58B6CCF0"/>
+    <w:lvl w:ilvl="0" w:tplc="04090001">
+      <w:start w:val="1"/>
+      <w:numFmt w:val="bullet"/>
+      <w:lvlText w:val=""/>
+      <w:lvlJc w:val="left"/>
+      <w:pPr>
+        <w:ind w:left="900" w:hanging="360"/>
+      </w:pPr>
+      <w:rPr>
+        <w:rFonts w:ascii="Symbol" w:hAnsi="Symbol" w:hint="default"/>
+      </w:rPr>
+    </w:lvl>
+    <w:lvl w:ilvl="1" w:tplc="04090003" w:tentative="1">
+      <w:start w:val="1"/>
+      <w:numFmt w:val="bullet"/>
+      <w:lvlText w:val="o"/>
+      <w:lvlJc w:val="left"/>
+      <w:pPr>
+        <w:ind w:left="1620" w:hanging="360"/>
+      </w:pPr>
+      <w:rPr>
+        <w:rFonts w:ascii="Courier New" w:hAnsi="Courier New" w:cs="Courier New" w:hint="default"/>
+      </w:rPr>
+    </w:lvl>
+    <w:lvl w:ilvl="2" w:tplc="04090005" w:tentative="1">
+      <w:start w:val="1"/>
+      <w:numFmt w:val="bullet"/>
+      <w:lvlText w:val=""/>
+      <w:lvlJc w:val="left"/>
+      <w:pPr>
+        <w:ind w:left="2340" w:hanging="360"/>
+      </w:pPr>
+      <w:rPr>
+        <w:rFonts w:ascii="Wingdings" w:hAnsi="Wingdings" w:hint="default"/>
+      </w:rPr>
+    </w:lvl>
+    <w:lvl w:ilvl="3" w:tplc="04090001" w:tentative="1">
+      <w:start w:val="1"/>
+      <w:numFmt w:val="bullet"/>
+      <w:lvlText w:val=""/>
+      <w:lvlJc w:val="left"/>
+      <w:pPr>
+        <w:ind w:left="3060" w:hanging="360"/>
+      </w:pPr>
+      <w:rPr>
+        <w:rFonts w:ascii="Symbol" w:hAnsi="Symbol" w:hint="default"/>
+      </w:rPr>
+    </w:lvl>
+    <w:lvl w:ilvl="4" w:tplc="04090003" w:tentative="1">
+      <w:start w:val="1"/>
+      <w:numFmt w:val="bullet"/>
+      <w:lvlText w:val="o"/>
+      <w:lvlJc w:val="left"/>
+      <w:pPr>
+        <w:ind w:left="3780" w:hanging="360"/>
+      </w:pPr>
+      <w:rPr>
+        <w:rFonts w:ascii="Courier New" w:hAnsi="Courier New" w:cs="Courier New" w:hint="default"/>
+      </w:rPr>
+    </w:lvl>
+    <w:lvl w:ilvl="5" w:tplc="04090005" w:tentative="1">
+      <w:start w:val="1"/>
+      <w:numFmt w:val="bullet"/>
+      <w:lvlText w:val=""/>
+      <w:lvlJc w:val="left"/>
+      <w:pPr>
+        <w:ind w:left="4500" w:hanging="360"/>
+      </w:pPr>
+      <w:rPr>
+        <w:rFonts w:ascii="Wingdings" w:hAnsi="Wingdings" w:hint="default"/>
+      </w:rPr>
+    </w:lvl>
+    <w:lvl w:ilvl="6" w:tplc="04090001" w:tentative="1">
+      <w:start w:val="1"/>
+      <w:numFmt w:val="bullet"/>
+      <w:lvlText w:val=""/>
+      <w:lvlJc w:val="left"/>
+      <w:pPr>
+        <w:ind w:left="5220" w:hanging="360"/>
+      </w:pPr>
+      <w:rPr>
+        <w:rFonts w:ascii="Symbol" w:hAnsi="Symbol" w:hint="default"/>
+      </w:rPr>
+    </w:lvl>
+    <w:lvl w:ilvl="7" w:tplc="04090003" w:tentative="1">
+      <w:start w:val="1"/>
+      <w:numFmt w:val="bullet"/>
+      <w:lvlText w:val="o"/>
+      <w:lvlJc w:val="left"/>
+      <w:pPr>
+        <w:ind w:left="5940" w:hanging="360"/>
+      </w:pPr>
+      <w:rPr>
+        <w:rFonts w:ascii="Courier New" w:hAnsi="Courier New" w:cs="Courier New" w:hint="default"/>
+      </w:rPr>
+    </w:lvl>
+    <w:lvl w:ilvl="8" w:tplc="04090005" w:tentative="1">
+      <w:start w:val="1"/>
+      <w:numFmt w:val="bullet"/>
+      <w:lvlText w:val=""/>
+      <w:lvlJc w:val="left"/>
+      <w:pPr>
+        <w:ind w:left="6660" w:hanging="360"/>
+      </w:pPr>
+      <w:rPr>
+        <w:rFonts w:ascii="Wingdings" w:hAnsi="Wingdings" w:hint="default"/>
+      </w:rPr>
+    </w:lvl>
+  </w:abstractNum>
+  <w:abstractNum w:abstractNumId="21" w15:restartNumberingAfterBreak="0">
     <w:nsid w:val="6CF55390"/>
     <w:multiLevelType w:val="multilevel"/>
     <w:tmpl w:val="F1E2235E"/>
@@ -5865,7 +7552,7 @@
       </w:rPr>
     </w:lvl>
   </w:abstractNum>
-  <w:abstractNum w:abstractNumId="21" w15:restartNumberingAfterBreak="0">
+  <w:abstractNum w:abstractNumId="22" w15:restartNumberingAfterBreak="0">
     <w:nsid w:val="700B369F"/>
     <w:multiLevelType w:val="multilevel"/>
     <w:tmpl w:val="53F6685C"/>
@@ -6014,77 +7701,80 @@
       </w:rPr>
     </w:lvl>
   </w:abstractNum>
-  <w:num w:numId="1">
+  <w:num w:numId="1" w16cid:durableId="656301316">
     <w:abstractNumId w:val="17"/>
   </w:num>
-  <w:num w:numId="2">
+  <w:num w:numId="2" w16cid:durableId="365646475">
     <w:abstractNumId w:val="6"/>
   </w:num>
-  <w:num w:numId="3">
+  <w:num w:numId="3" w16cid:durableId="1736664238">
     <w:abstractNumId w:val="15"/>
   </w:num>
-  <w:num w:numId="4">
+  <w:num w:numId="4" w16cid:durableId="216551914">
     <w:abstractNumId w:val="3"/>
   </w:num>
-  <w:num w:numId="5">
+  <w:num w:numId="5" w16cid:durableId="495923794">
     <w:abstractNumId w:val="7"/>
   </w:num>
-  <w:num w:numId="6">
+  <w:num w:numId="6" w16cid:durableId="1555653145">
     <w:abstractNumId w:val="14"/>
   </w:num>
-  <w:num w:numId="7">
+  <w:num w:numId="7" w16cid:durableId="1784183557">
     <w:abstractNumId w:val="9"/>
   </w:num>
-  <w:num w:numId="8">
+  <w:num w:numId="8" w16cid:durableId="1105731852">
     <w:abstractNumId w:val="16"/>
   </w:num>
-  <w:num w:numId="9">
+  <w:num w:numId="9" w16cid:durableId="719017882">
     <w:abstractNumId w:val="12"/>
   </w:num>
-  <w:num w:numId="10">
-    <w:abstractNumId w:val="20"/>
+  <w:num w:numId="10" w16cid:durableId="60100448">
+    <w:abstractNumId w:val="21"/>
   </w:num>
-  <w:num w:numId="11">
+  <w:num w:numId="11" w16cid:durableId="556282916">
     <w:abstractNumId w:val="4"/>
   </w:num>
-  <w:num w:numId="12">
+  <w:num w:numId="12" w16cid:durableId="1684017305">
     <w:abstractNumId w:val="13"/>
   </w:num>
-  <w:num w:numId="13">
+  <w:num w:numId="13" w16cid:durableId="989480651">
     <w:abstractNumId w:val="0"/>
   </w:num>
-  <w:num w:numId="14">
+  <w:num w:numId="14" w16cid:durableId="450713303">
     <w:abstractNumId w:val="8"/>
   </w:num>
-  <w:num w:numId="15">
+  <w:num w:numId="15" w16cid:durableId="837381359">
     <w:abstractNumId w:val="18"/>
   </w:num>
-  <w:num w:numId="16">
+  <w:num w:numId="16" w16cid:durableId="1234895053">
     <w:abstractNumId w:val="10"/>
   </w:num>
-  <w:num w:numId="17">
+  <w:num w:numId="17" w16cid:durableId="868181617">
     <w:abstractNumId w:val="19"/>
   </w:num>
-  <w:num w:numId="18">
+  <w:num w:numId="18" w16cid:durableId="2131629324">
     <w:abstractNumId w:val="11"/>
   </w:num>
-  <w:num w:numId="19">
+  <w:num w:numId="19" w16cid:durableId="62603678">
     <w:abstractNumId w:val="5"/>
   </w:num>
-  <w:num w:numId="20">
-    <w:abstractNumId w:val="21"/>
+  <w:num w:numId="20" w16cid:durableId="1390422818">
+    <w:abstractNumId w:val="22"/>
   </w:num>
-  <w:num w:numId="21">
+  <w:num w:numId="21" w16cid:durableId="158692040">
     <w:abstractNumId w:val="2"/>
   </w:num>
-  <w:num w:numId="22">
+  <w:num w:numId="22" w16cid:durableId="1121001759">
     <w:abstractNumId w:val="1"/>
+  </w:num>
+  <w:num w:numId="23" w16cid:durableId="850951282">
+    <w:abstractNumId w:val="20"/>
   </w:num>
 </w:numbering>
 </file>
 
 <file path=word/styles.xml><?xml version="1.0" encoding="utf-8"?>
-<w:styles xmlns:mc="http://schemas.openxmlformats.org/markup-compatibility/2006" xmlns:r="http://schemas.openxmlformats.org/officeDocument/2006/relationships" xmlns:w="http://schemas.openxmlformats.org/wordprocessingml/2006/main" xmlns:w14="http://schemas.microsoft.com/office/word/2010/wordml" xmlns:w15="http://schemas.microsoft.com/office/word/2012/wordml" xmlns:w16cid="http://schemas.microsoft.com/office/word/2016/wordml/cid" xmlns:w16se="http://schemas.microsoft.com/office/word/2015/wordml/symex" mc:Ignorable="w14 w15 w16se w16cid">
+<w:styles xmlns:mc="http://schemas.openxmlformats.org/markup-compatibility/2006" xmlns:r="http://schemas.openxmlformats.org/officeDocument/2006/relationships" xmlns:w="http://schemas.openxmlformats.org/wordprocessingml/2006/main" xmlns:w14="http://schemas.microsoft.com/office/word/2010/wordml" xmlns:w15="http://schemas.microsoft.com/office/word/2012/wordml" xmlns:w16cex="http://schemas.microsoft.com/office/word/2018/wordml/cex" xmlns:w16cid="http://schemas.microsoft.com/office/word/2016/wordml/cid" xmlns:w16="http://schemas.microsoft.com/office/word/2018/wordml" xmlns:w16du="http://schemas.microsoft.com/office/word/2023/wordml/word16du" xmlns:w16sdtdh="http://schemas.microsoft.com/office/word/2020/wordml/sdtdatahash" xmlns:w16sdtfl="http://schemas.microsoft.com/office/word/2024/wordml/sdtformatlock" xmlns:w16se="http://schemas.microsoft.com/office/word/2015/wordml/symex" mc:Ignorable="w14 w15 w16se w16cid w16 w16cex w16sdtdh w16sdtfl w16du">
   <w:docDefaults>
     <w:rPrDefault>
       <w:rPr>
@@ -6509,7 +8199,6 @@
   <w:style w:type="character" w:default="1" w:styleId="DefaultParagraphFont">
     <w:name w:val="Default Paragraph Font"/>
     <w:uiPriority w:val="1"/>
-    <w:semiHidden/>
     <w:unhideWhenUsed/>
   </w:style>
   <w:style w:type="table" w:default="1" w:styleId="TableNormal">
@@ -6552,7 +8241,6 @@
     <w:name w:val="Hyperlink"/>
     <w:basedOn w:val="DefaultParagraphFont"/>
     <w:uiPriority w:val="99"/>
-    <w:semiHidden/>
     <w:unhideWhenUsed/>
     <w:rsid w:val="003C7260"/>
     <w:rPr>
@@ -6583,6 +8271,18 @@
       <w:ind w:left="720"/>
       <w:contextualSpacing/>
     </w:pPr>
+  </w:style>
+  <w:style w:type="character" w:styleId="UnresolvedMention">
+    <w:name w:val="Unresolved Mention"/>
+    <w:basedOn w:val="DefaultParagraphFont"/>
+    <w:uiPriority w:val="99"/>
+    <w:semiHidden/>
+    <w:unhideWhenUsed/>
+    <w:rsid w:val="00060E5A"/>
+    <w:rPr>
+      <w:color w:val="605E5C"/>
+      <w:shd w:val="clear" w:color="auto" w:fill="E1DFDD"/>
+    </w:rPr>
   </w:style>
 </w:styles>
 </file>

</xml_diff>